<commit_message>
TS 7.2 Ghanam Jatai final files
</commit_message>
<xml_diff>
--- a/TS Jatai Ghanam Project/TS 7.2/TS 7.2 Jatai Tamil Corrections.docx
+++ b/TS Jatai Ghanam Project/TS 7.2/TS 7.2 Jatai Tamil Corrections.docx
@@ -215,179 +215,359 @@
           </w:tcPr>
           <w:p>
             <w:pPr>
-              <w:widowControl w:val="0"/>
               <w:autoSpaceDE w:val="0"/>
               <w:autoSpaceDN w:val="0"/>
               <w:adjustRightInd w:val="0"/>
-              <w:spacing w:line="240" w:lineRule="auto"/>
-              <w:rPr>
-                <w:rFonts w:ascii="BRH Devanagari Extra" w:hAnsi="BRH Devanagari Extra" w:cs="BRH Devanagari Extra"/>
-                <w:color w:val="000000"/>
-                <w:sz w:val="32"/>
-                <w:szCs w:val="32"/>
+              <w:rPr>
+                <w:rFonts w:ascii="Latha" w:hAnsi="Latha" w:cs="Latha"/>
+                <w:szCs w:val="24"/>
+                <w:lang w:bidi="ta-IN"/>
+                <w14:ligatures w14:val="standardContextual"/>
               </w:rPr>
             </w:pPr>
             <w:r>
               <w:rPr>
-                <w:rFonts w:ascii="BRH Devanagari Extra" w:hAnsi="BRH Devanagari Extra" w:cs="BRH Devanagari Extra"/>
-                <w:color w:val="000000"/>
-                <w:sz w:val="32"/>
-                <w:szCs w:val="32"/>
+                <w:rFonts w:ascii="Latha" w:hAnsi="Latha" w:cs="Latha"/>
+                <w:b/>
+                <w:bCs/>
+                <w:szCs w:val="24"/>
+                <w:lang w:bidi="ta-IN"/>
+                <w14:ligatures w14:val="standardContextual"/>
               </w:rPr>
               <w:t>(</w:t>
             </w:r>
             <w:r>
               <w:rPr>
-                <w:rFonts w:cs="BRH Devanagari Extra"/>
-                <w:color w:val="000000"/>
-                <w:szCs w:val="32"/>
+                <w:rFonts w:ascii="Latha" w:hAnsi="Latha" w:cs="Latha"/>
+                <w:b/>
+                <w:bCs/>
+                <w:szCs w:val="24"/>
+                <w:cs/>
+                <w:lang w:bidi="ta-IN"/>
+                <w14:ligatures w14:val="standardContextual"/>
               </w:rPr>
               <w:t>68</w:t>
             </w:r>
             <w:r>
               <w:rPr>
-                <w:rFonts w:ascii="BRH Devanagari Extra" w:hAnsi="BRH Devanagari Extra" w:cs="BRH Devanagari Extra"/>
-                <w:color w:val="000000"/>
-                <w:sz w:val="32"/>
-                <w:szCs w:val="32"/>
+                <w:rFonts w:ascii="Latha" w:hAnsi="Latha" w:cs="Latha"/>
+                <w:b/>
+                <w:bCs/>
+                <w:szCs w:val="24"/>
+                <w:lang w:bidi="ta-IN"/>
+                <w14:ligatures w14:val="standardContextual"/>
               </w:rPr>
               <w:t>)</w:t>
             </w:r>
             <w:r>
               <w:rPr>
-                <w:rFonts w:cs="BRH Devanagari Extra"/>
-                <w:color w:val="000000"/>
-                <w:szCs w:val="32"/>
-              </w:rPr>
-              <w:t>[P3</w:t>
-            </w:r>
-            <w:r>
-              <w:rPr>
-                <w:rFonts w:ascii="BRH Devanagari Extra" w:hAnsi="BRH Devanagari Extra" w:cs="BRH Devanagari Extra"/>
-                <w:color w:val="000000"/>
-                <w:sz w:val="32"/>
-                <w:szCs w:val="32"/>
-              </w:rPr>
-              <w:t xml:space="preserve">] </w:t>
-            </w:r>
-            <w:r>
-              <w:rPr>
-                <w:rFonts w:cs="BRH Devanagari Extra"/>
-                <w:color w:val="000000"/>
-                <w:szCs w:val="32"/>
+                <w:rFonts w:ascii="Latha" w:hAnsi="Latha" w:cs="Latha"/>
+                <w:b/>
+                <w:bCs/>
+                <w:szCs w:val="24"/>
+                <w:lang w:bidi="ta-IN"/>
+                <w14:ligatures w14:val="standardContextual"/>
+              </w:rPr>
+              <w:t>[</w:t>
+            </w:r>
+            <w:r>
+              <w:rPr>
+                <w:rFonts w:ascii="Latha" w:hAnsi="Latha" w:cs="Latha"/>
+                <w:b/>
+                <w:bCs/>
+                <w:szCs w:val="24"/>
+                <w:cs/>
+                <w:lang w:bidi="ta-IN"/>
+                <w14:ligatures w14:val="standardContextual"/>
+              </w:rPr>
+              <w:t>ப</w:t>
+            </w:r>
+            <w:r>
+              <w:rPr>
+                <w:rFonts w:ascii="Latha" w:hAnsi="Latha" w:cs="Latha"/>
+                <w:b/>
+                <w:bCs/>
+                <w:szCs w:val="24"/>
+                <w:lang w:bidi="ta-IN"/>
+                <w14:ligatures w14:val="standardContextual"/>
+              </w:rPr>
+              <w:t>3</w:t>
+            </w:r>
+            <w:r>
+              <w:rPr>
+                <w:rFonts w:ascii="Latha" w:hAnsi="Latha" w:cs="Latha"/>
+                <w:b/>
+                <w:bCs/>
+                <w:szCs w:val="24"/>
+                <w:lang w:bidi="ta-IN"/>
+                <w14:ligatures w14:val="standardContextual"/>
+              </w:rPr>
+              <w:t>]</w:t>
+            </w:r>
+            <w:r>
+              <w:rPr>
+                <w:rFonts w:ascii="Latha" w:hAnsi="Latha" w:cs="Latha"/>
+                <w:szCs w:val="24"/>
+                <w:lang w:bidi="ta-IN"/>
+                <w14:ligatures w14:val="standardContextual"/>
+              </w:rPr>
+              <w:t xml:space="preserve"> </w:t>
+            </w:r>
+            <w:r>
+              <w:rPr>
+                <w:rFonts w:ascii="Latha" w:hAnsi="Latha" w:cs="Latha"/>
+                <w:b/>
+                <w:bCs/>
+                <w:szCs w:val="24"/>
+                <w:cs/>
+                <w:lang w:bidi="ta-IN"/>
+                <w14:ligatures w14:val="standardContextual"/>
               </w:rPr>
               <w:t>7</w:t>
             </w:r>
             <w:r>
               <w:rPr>
-                <w:rFonts w:ascii="BRH Devanagari Extra" w:hAnsi="BRH Devanagari Extra" w:cs="BRH Devanagari Extra"/>
-                <w:color w:val="000000"/>
-                <w:sz w:val="32"/>
-                <w:szCs w:val="32"/>
+                <w:rFonts w:ascii="Latha" w:hAnsi="Latha" w:cs="Latha"/>
+                <w:b/>
+                <w:bCs/>
+                <w:szCs w:val="24"/>
+                <w:lang w:bidi="ta-IN"/>
+                <w14:ligatures w14:val="standardContextual"/>
+              </w:rPr>
+              <w:t>.2</w:t>
+            </w:r>
+            <w:r>
+              <w:rPr>
+                <w:rFonts w:ascii="Latha" w:hAnsi="Latha" w:cs="Latha"/>
+                <w:b/>
+                <w:bCs/>
+                <w:szCs w:val="24"/>
+                <w:lang w:bidi="ta-IN"/>
+                <w14:ligatures w14:val="standardContextual"/>
               </w:rPr>
               <w:t>.</w:t>
             </w:r>
             <w:r>
               <w:rPr>
-                <w:rFonts w:cs="BRH Devanagari Extra"/>
-                <w:color w:val="000000"/>
-                <w:szCs w:val="32"/>
-              </w:rPr>
-              <w:t>2</w:t>
-            </w:r>
-            <w:r>
-              <w:rPr>
-                <w:rFonts w:ascii="BRH Devanagari Extra" w:hAnsi="BRH Devanagari Extra" w:cs="BRH Devanagari Extra"/>
-                <w:color w:val="000000"/>
-                <w:sz w:val="32"/>
-                <w:szCs w:val="32"/>
-              </w:rPr>
-              <w:t>.</w:t>
-            </w:r>
-            <w:r>
-              <w:rPr>
-                <w:rFonts w:cs="BRH Devanagari Extra"/>
-                <w:color w:val="000000"/>
-                <w:szCs w:val="32"/>
+                <w:rFonts w:ascii="Latha" w:hAnsi="Latha" w:cs="Latha"/>
+                <w:b/>
+                <w:bCs/>
+                <w:szCs w:val="24"/>
+                <w:cs/>
+                <w:lang w:bidi="ta-IN"/>
+                <w14:ligatures w14:val="standardContextual"/>
               </w:rPr>
               <w:t>1</w:t>
             </w:r>
             <w:r>
               <w:rPr>
-                <w:rFonts w:ascii="BRH Devanagari Extra" w:hAnsi="BRH Devanagari Extra" w:cs="BRH Devanagari Extra"/>
-                <w:color w:val="000000"/>
-                <w:sz w:val="32"/>
-                <w:szCs w:val="32"/>
-              </w:rPr>
-              <w:t>.</w:t>
-            </w:r>
-            <w:r>
-              <w:rPr>
-                <w:rFonts w:cs="BRH Devanagari Extra"/>
-                <w:color w:val="000000"/>
-                <w:szCs w:val="32"/>
-              </w:rPr>
-              <w:t>3</w:t>
-            </w:r>
-            <w:r>
-              <w:rPr>
-                <w:rFonts w:ascii="BRH Devanagari Extra" w:hAnsi="BRH Devanagari Extra" w:cs="BRH Devanagari Extra"/>
-                <w:color w:val="000000"/>
-                <w:sz w:val="32"/>
-                <w:szCs w:val="32"/>
+                <w:rFonts w:ascii="Latha" w:hAnsi="Latha" w:cs="Latha"/>
+                <w:b/>
+                <w:bCs/>
+                <w:szCs w:val="24"/>
+                <w:lang w:bidi="ta-IN"/>
+                <w14:ligatures w14:val="standardContextual"/>
+              </w:rPr>
+              <w:t>.3</w:t>
+            </w:r>
+            <w:r>
+              <w:rPr>
+                <w:rFonts w:ascii="Latha" w:hAnsi="Latha" w:cs="Latha"/>
+                <w:b/>
+                <w:bCs/>
+                <w:szCs w:val="24"/>
+                <w:lang w:bidi="ta-IN"/>
+                <w14:ligatures w14:val="standardContextual"/>
+              </w:rPr>
+              <w:t>(4</w:t>
+            </w:r>
+            <w:r>
+              <w:rPr>
+                <w:rFonts w:ascii="Latha" w:hAnsi="Latha" w:cs="Latha"/>
+                <w:b/>
+                <w:bCs/>
+                <w:szCs w:val="24"/>
+                <w:cs/>
+                <w:lang w:bidi="ta-IN"/>
+                <w14:ligatures w14:val="standardContextual"/>
+              </w:rPr>
+              <w:t>7</w:t>
+            </w:r>
+            <w:r>
+              <w:rPr>
+                <w:rFonts w:ascii="Latha" w:hAnsi="Latha" w:cs="Latha"/>
+                <w:b/>
+                <w:bCs/>
+                <w:szCs w:val="24"/>
+                <w:lang w:bidi="ta-IN"/>
+                <w14:ligatures w14:val="standardContextual"/>
+              </w:rPr>
+              <w:t>)</w:t>
+            </w:r>
+            <w:r>
+              <w:rPr>
+                <w:rFonts w:ascii="Latha" w:hAnsi="Latha" w:cs="Latha"/>
+                <w:szCs w:val="24"/>
+                <w:lang w:bidi="ta-IN"/>
+                <w14:ligatures w14:val="standardContextual"/>
+              </w:rPr>
+              <w:t xml:space="preserve">-  </w:t>
+            </w:r>
+            <w:r>
+              <w:rPr>
+                <w:rFonts w:ascii="Latha" w:hAnsi="Latha" w:cs="Latha"/>
+                <w:szCs w:val="24"/>
+                <w:cs/>
+                <w:lang w:bidi="ta-IN"/>
+                <w14:ligatures w14:val="standardContextual"/>
+              </w:rPr>
+              <w:t xml:space="preserve">ப்ராங் </w:t>
+            </w:r>
+            <w:r>
+              <w:rPr>
+                <w:rFonts w:ascii="Latha" w:hAnsi="Latha" w:cs="Latha"/>
+                <w:szCs w:val="24"/>
+                <w:lang w:bidi="ta-IN"/>
+                <w14:ligatures w14:val="standardContextual"/>
+              </w:rPr>
+              <w:t xml:space="preserve">| </w:t>
+            </w:r>
+            <w:r>
+              <w:rPr>
+                <w:rFonts w:ascii="Latha" w:hAnsi="Latha" w:cs="Latha"/>
+                <w:szCs w:val="24"/>
+                <w:cs/>
+                <w:lang w:bidi="ta-IN"/>
+                <w14:ligatures w14:val="standardContextual"/>
+              </w:rPr>
+              <w:t>இ</w:t>
+            </w:r>
+            <w:r>
+              <w:rPr>
+                <w:rFonts w:ascii="BRH Tamil Tab Extra" w:hAnsi="BRH Tamil Tab Extra" w:cs="Latha"/>
+                <w:b/>
+                <w:bCs/>
+                <w:szCs w:val="28"/>
+                <w:lang w:bidi="ta-IN"/>
+                <w14:ligatures w14:val="standardContextual"/>
+              </w:rPr>
+              <w:t>…</w:t>
+            </w:r>
+            <w:r>
+              <w:rPr>
+                <w:rFonts w:ascii="Latha" w:hAnsi="Latha" w:cs="Latha"/>
+                <w:szCs w:val="24"/>
+                <w:cs/>
+                <w:lang w:bidi="ta-IN"/>
+                <w14:ligatures w14:val="standardContextual"/>
+              </w:rPr>
+              <w:t>வ</w:t>
+            </w:r>
+            <w:r>
+              <w:rPr>
+                <w:rFonts w:ascii="BRH Tamil Tab Extra" w:hAnsi="BRH Tamil Tab Extra" w:cs="Latha"/>
+                <w:b/>
+                <w:bCs/>
+                <w:szCs w:val="28"/>
+                <w:lang w:bidi="ta-IN"/>
+                <w14:ligatures w14:val="standardContextual"/>
+              </w:rPr>
+              <w:t>…</w:t>
+            </w:r>
+            <w:r>
+              <w:rPr>
+                <w:rFonts w:ascii="Latha" w:hAnsi="Latha" w:cs="Latha"/>
+                <w:szCs w:val="24"/>
+                <w:lang w:bidi="ta-IN"/>
+                <w14:ligatures w14:val="standardContextual"/>
+              </w:rPr>
+              <w:t xml:space="preserve"> | </w:t>
+            </w:r>
+            <w:r>
+              <w:rPr>
+                <w:rFonts w:ascii="Latha" w:hAnsi="Latha" w:cs="Latha"/>
+                <w:b/>
+                <w:bCs/>
+                <w:szCs w:val="24"/>
+                <w:lang w:bidi="ta-IN"/>
+                <w14:ligatures w14:val="standardContextual"/>
               </w:rPr>
               <w:t>(</w:t>
             </w:r>
             <w:r>
               <w:rPr>
-                <w:rFonts w:cs="BRH Devanagari Extra"/>
-                <w:color w:val="000000"/>
-                <w:szCs w:val="32"/>
-              </w:rPr>
-              <w:t>47</w:t>
-            </w:r>
-            <w:r>
-              <w:rPr>
-                <w:rFonts w:ascii="BRH Devanagari Extra" w:hAnsi="BRH Devanagari Extra" w:cs="BRH Devanagari Extra"/>
-                <w:color w:val="000000"/>
-                <w:sz w:val="32"/>
-                <w:szCs w:val="32"/>
-              </w:rPr>
-              <w:t>)- mÉëÉXèû | C</w:t>
-            </w:r>
-            <w:r>
-              <w:rPr>
-                <w:rFonts w:ascii="BRH Malayalam Extra" w:hAnsi="BRH Malayalam Extra" w:cs="BRH Devanagari Extra"/>
-                <w:color w:val="000000"/>
-                <w:szCs w:val="32"/>
-              </w:rPr>
-              <w:t>–</w:t>
-            </w:r>
-            <w:r>
-              <w:rPr>
-                <w:rFonts w:ascii="BRH Devanagari Extra" w:hAnsi="BRH Devanagari Extra" w:cs="BRH Devanagari Extra"/>
-                <w:color w:val="000000"/>
-                <w:sz w:val="32"/>
-                <w:szCs w:val="32"/>
-              </w:rPr>
-              <w:t>uÉ</w:t>
-            </w:r>
-            <w:r>
-              <w:rPr>
-                <w:rFonts w:ascii="BRH Malayalam Extra" w:hAnsi="BRH Malayalam Extra" w:cs="BRH Devanagari Extra"/>
-                <w:color w:val="000000"/>
-                <w:szCs w:val="32"/>
-              </w:rPr>
-              <w:t>–</w:t>
-            </w:r>
-            <w:r>
-              <w:rPr>
-                <w:rFonts w:ascii="BRH Devanagari Extra" w:hAnsi="BRH Devanagari Extra" w:cs="BRH Devanagari Extra"/>
-                <w:color w:val="000000"/>
-                <w:sz w:val="32"/>
-                <w:szCs w:val="32"/>
-              </w:rPr>
-              <w:t xml:space="preserve"> | </w:t>
+                <w:rFonts w:ascii="Latha" w:hAnsi="Latha" w:cs="Latha"/>
+                <w:b/>
+                <w:bCs/>
+                <w:szCs w:val="24"/>
+                <w:lang w:bidi="ta-IN"/>
+                <w14:ligatures w14:val="standardContextual"/>
+              </w:rPr>
+              <w:t>GS</w:t>
+            </w:r>
+            <w:r>
+              <w:rPr>
+                <w:rFonts w:ascii="Latha" w:hAnsi="Latha" w:cs="Latha"/>
+                <w:szCs w:val="24"/>
+                <w:lang w:bidi="ta-IN"/>
+                <w14:ligatures w14:val="standardContextual"/>
+              </w:rPr>
+              <w:t>-</w:t>
+            </w:r>
+            <w:r>
+              <w:rPr>
+                <w:rFonts w:ascii="Latha" w:hAnsi="Latha" w:cs="Latha"/>
+                <w:b/>
+                <w:bCs/>
+                <w:szCs w:val="24"/>
+                <w:cs/>
+                <w:lang w:bidi="ta-IN"/>
+                <w14:ligatures w14:val="standardContextual"/>
+              </w:rPr>
+              <w:t>7</w:t>
+            </w:r>
+            <w:r>
+              <w:rPr>
+                <w:rFonts w:ascii="Latha" w:hAnsi="Latha" w:cs="Latha"/>
+                <w:b/>
+                <w:bCs/>
+                <w:szCs w:val="24"/>
+                <w:lang w:bidi="ta-IN"/>
+                <w14:ligatures w14:val="standardContextual"/>
+              </w:rPr>
+              <w:t>.2</w:t>
+            </w:r>
+            <w:r>
+              <w:rPr>
+                <w:rFonts w:ascii="Latha" w:hAnsi="Latha" w:cs="Latha"/>
+                <w:szCs w:val="24"/>
+                <w:lang w:bidi="ta-IN"/>
+                <w14:ligatures w14:val="standardContextual"/>
+              </w:rPr>
+              <w:t>-</w:t>
+            </w:r>
+            <w:r>
+              <w:rPr>
+                <w:rFonts w:ascii="Latha" w:hAnsi="Latha" w:cs="Latha"/>
+                <w:b/>
+                <w:bCs/>
+                <w:szCs w:val="24"/>
+                <w:lang w:bidi="ta-IN"/>
+                <w14:ligatures w14:val="standardContextual"/>
+              </w:rPr>
+              <w:t>0</w:t>
+            </w:r>
+            <w:r>
+              <w:rPr>
+                <w:rFonts w:ascii="Latha" w:hAnsi="Latha" w:cs="Latha"/>
+                <w:b/>
+                <w:bCs/>
+                <w:szCs w:val="24"/>
+                <w:cs/>
+                <w:lang w:bidi="ta-IN"/>
+                <w14:ligatures w14:val="standardContextual"/>
+              </w:rPr>
+              <w:t>3)</w:t>
             </w:r>
           </w:p>
           <w:p>
@@ -406,67 +586,116 @@
             </w:pPr>
             <w:r>
               <w:rPr>
-                <w:rFonts w:ascii="BRH Devanagari Extra" w:hAnsi="BRH Devanagari Extra" w:cs="BRH Devanagari Extra"/>
-                <w:color w:val="000000"/>
-                <w:sz w:val="32"/>
-                <w:szCs w:val="32"/>
-              </w:rPr>
-              <w:t>mÉëÉ</w:t>
-            </w:r>
-            <w:r>
-              <w:rPr>
-                <w:rFonts w:ascii="BRH Devanagari Extra" w:hAnsi="BRH Devanagari Extra" w:cs="BRH Devanagari Extra"/>
-                <w:color w:val="000000"/>
-                <w:sz w:val="32"/>
-                <w:szCs w:val="32"/>
+                <w:rFonts w:ascii="Latha" w:hAnsi="Latha" w:cs="Latha"/>
+                <w:szCs w:val="24"/>
+                <w:cs/>
+                <w:lang w:bidi="ta-IN"/>
+                <w14:ligatures w14:val="standardContextual"/>
+              </w:rPr>
+              <w:t>ப்ரா</w:t>
+            </w:r>
+            <w:r>
+              <w:rPr>
+                <w:rFonts w:ascii="Latha" w:hAnsi="Latha" w:cs="Latha"/>
+                <w:szCs w:val="24"/>
                 <w:highlight w:val="yellow"/>
-              </w:rPr>
-              <w:t>X</w:t>
-            </w:r>
-            <w:r>
-              <w:rPr>
-                <w:rFonts w:ascii="BRH Devanagari Extra" w:hAnsi="BRH Devanagari Extra" w:cs="BRH Devanagari Extra"/>
-                <w:color w:val="000000"/>
-                <w:sz w:val="32"/>
-                <w:szCs w:val="32"/>
-              </w:rPr>
-              <w:t>èû ÌXûþuÉåuÉ</w:t>
-            </w:r>
-            <w:r>
-              <w:rPr>
-                <w:rFonts w:ascii="BRH Malayalam Extra" w:hAnsi="BRH Malayalam Extra" w:cs="BRH Devanagari Extra"/>
-                <w:color w:val="000000"/>
-                <w:szCs w:val="32"/>
-              </w:rPr>
-              <w:t>–</w:t>
-            </w:r>
-            <w:r>
-              <w:rPr>
-                <w:rFonts w:ascii="BRH Devanagari Extra" w:hAnsi="BRH Devanagari Extra" w:cs="BRH Devanagari Extra"/>
-                <w:color w:val="000000"/>
-                <w:sz w:val="32"/>
-                <w:szCs w:val="32"/>
-              </w:rPr>
-              <w:t xml:space="preserve"> mÉëÉXèû mÉëÉ</w:t>
-            </w:r>
-            <w:r>
-              <w:rPr>
-                <w:rFonts w:ascii="BRH Devanagari Extra" w:hAnsi="BRH Devanagari Extra" w:cs="BRH Devanagari Extra"/>
-                <w:color w:val="000000"/>
-                <w:sz w:val="32"/>
-                <w:szCs w:val="32"/>
+                <w:cs/>
+                <w:lang w:bidi="ta-IN"/>
+                <w14:ligatures w14:val="standardContextual"/>
+              </w:rPr>
+              <w:t>ங் ஙி</w:t>
+            </w:r>
+            <w:r>
+              <w:rPr>
+                <w:rFonts w:ascii="BRH Tamil Tab Extra" w:hAnsi="BRH Tamil Tab Extra" w:cs="Latha"/>
+                <w:b/>
+                <w:bCs/>
+                <w:szCs w:val="28"/>
+                <w:lang w:bidi="ta-IN"/>
+                <w14:ligatures w14:val="standardContextual"/>
+              </w:rPr>
+              <w:t>†</w:t>
+            </w:r>
+            <w:r>
+              <w:rPr>
+                <w:rFonts w:ascii="Latha" w:hAnsi="Latha" w:cs="Latha"/>
+                <w:szCs w:val="24"/>
+                <w:cs/>
+                <w:lang w:bidi="ta-IN"/>
+                <w14:ligatures w14:val="standardContextual"/>
+              </w:rPr>
+              <w:t>வேவ</w:t>
+            </w:r>
+            <w:r>
+              <w:rPr>
+                <w:rFonts w:ascii="BRH Tamil Tab Extra" w:hAnsi="BRH Tamil Tab Extra" w:cs="Latha"/>
+                <w:b/>
+                <w:bCs/>
+                <w:szCs w:val="28"/>
+                <w:lang w:bidi="ta-IN"/>
+                <w14:ligatures w14:val="standardContextual"/>
+              </w:rPr>
+              <w:t>…</w:t>
+            </w:r>
+            <w:r>
+              <w:rPr>
+                <w:rFonts w:ascii="Latha" w:hAnsi="Latha" w:cs="Latha"/>
+                <w:szCs w:val="24"/>
+                <w:lang w:bidi="ta-IN"/>
+                <w14:ligatures w14:val="standardContextual"/>
+              </w:rPr>
+              <w:t xml:space="preserve"> </w:t>
+            </w:r>
+            <w:r>
+              <w:rPr>
+                <w:rFonts w:ascii="Latha" w:hAnsi="Latha" w:cs="Latha"/>
+                <w:szCs w:val="24"/>
+                <w:cs/>
+                <w:lang w:bidi="ta-IN"/>
+                <w14:ligatures w14:val="standardContextual"/>
+              </w:rPr>
+              <w:t>ப்ராங் ப்ரா</w:t>
+            </w:r>
+            <w:r>
+              <w:rPr>
+                <w:rFonts w:ascii="Latha" w:hAnsi="Latha" w:cs="Latha"/>
+                <w:szCs w:val="24"/>
                 <w:highlight w:val="yellow"/>
-              </w:rPr>
-              <w:t>X</w:t>
-            </w:r>
-            <w:r>
-              <w:rPr>
-                <w:rFonts w:ascii="BRH Devanagari Extra" w:hAnsi="BRH Devanagari Extra" w:cs="BRH Devanagari Extra"/>
-                <w:color w:val="000000"/>
-                <w:sz w:val="32"/>
-                <w:szCs w:val="32"/>
-              </w:rPr>
-              <w:t xml:space="preserve">èû ÌXûþuÉ | </w:t>
+                <w:cs/>
+                <w:lang w:bidi="ta-IN"/>
+                <w14:ligatures w14:val="standardContextual"/>
+              </w:rPr>
+              <w:t>ங் ஙி</w:t>
+            </w:r>
+            <w:r>
+              <w:rPr>
+                <w:rFonts w:ascii="BRH Tamil Tab Extra" w:hAnsi="BRH Tamil Tab Extra" w:cs="Latha"/>
+                <w:b/>
+                <w:bCs/>
+                <w:szCs w:val="28"/>
+                <w:lang w:bidi="ta-IN"/>
+                <w14:ligatures w14:val="standardContextual"/>
+              </w:rPr>
+              <w:t>†</w:t>
+            </w:r>
+            <w:r>
+              <w:rPr>
+                <w:rFonts w:ascii="Latha" w:hAnsi="Latha" w:cs="Latha"/>
+                <w:szCs w:val="24"/>
+                <w:cs/>
+                <w:lang w:bidi="ta-IN"/>
+                <w14:ligatures w14:val="standardContextual"/>
+              </w:rPr>
+              <w:t xml:space="preserve">வ </w:t>
+            </w:r>
+            <w:r>
+              <w:rPr>
+                <w:rFonts w:ascii="Latha" w:hAnsi="Latha" w:cs="Latha"/>
+                <w:szCs w:val="24"/>
+                <w:lang w:bidi="ta-IN"/>
+                <w14:ligatures w14:val="standardContextual"/>
+              </w:rPr>
+              <w:t>|</w:t>
             </w:r>
           </w:p>
         </w:tc>
@@ -476,179 +705,359 @@
           </w:tcPr>
           <w:p>
             <w:pPr>
-              <w:widowControl w:val="0"/>
               <w:autoSpaceDE w:val="0"/>
               <w:autoSpaceDN w:val="0"/>
               <w:adjustRightInd w:val="0"/>
-              <w:spacing w:line="240" w:lineRule="auto"/>
-              <w:rPr>
-                <w:rFonts w:ascii="BRH Devanagari Extra" w:hAnsi="BRH Devanagari Extra" w:cs="BRH Devanagari Extra"/>
-                <w:color w:val="000000"/>
-                <w:sz w:val="32"/>
-                <w:szCs w:val="32"/>
+              <w:rPr>
+                <w:rFonts w:ascii="Latha" w:hAnsi="Latha" w:cs="Latha"/>
+                <w:szCs w:val="24"/>
+                <w:lang w:bidi="ta-IN"/>
+                <w14:ligatures w14:val="standardContextual"/>
               </w:rPr>
             </w:pPr>
             <w:r>
               <w:rPr>
-                <w:rFonts w:ascii="BRH Devanagari Extra" w:hAnsi="BRH Devanagari Extra" w:cs="BRH Devanagari Extra"/>
-                <w:color w:val="000000"/>
-                <w:sz w:val="32"/>
-                <w:szCs w:val="32"/>
+                <w:rFonts w:ascii="Latha" w:hAnsi="Latha" w:cs="Latha"/>
+                <w:b/>
+                <w:bCs/>
+                <w:szCs w:val="24"/>
+                <w:lang w:bidi="ta-IN"/>
+                <w14:ligatures w14:val="standardContextual"/>
               </w:rPr>
               <w:t>(</w:t>
             </w:r>
             <w:r>
               <w:rPr>
-                <w:rFonts w:cs="BRH Devanagari Extra"/>
-                <w:color w:val="000000"/>
-                <w:szCs w:val="32"/>
+                <w:rFonts w:ascii="Latha" w:hAnsi="Latha" w:cs="Latha"/>
+                <w:b/>
+                <w:bCs/>
+                <w:szCs w:val="24"/>
+                <w:cs/>
+                <w:lang w:bidi="ta-IN"/>
+                <w14:ligatures w14:val="standardContextual"/>
               </w:rPr>
               <w:t>68</w:t>
             </w:r>
             <w:r>
               <w:rPr>
-                <w:rFonts w:ascii="BRH Devanagari Extra" w:hAnsi="BRH Devanagari Extra" w:cs="BRH Devanagari Extra"/>
-                <w:color w:val="000000"/>
-                <w:sz w:val="32"/>
-                <w:szCs w:val="32"/>
+                <w:rFonts w:ascii="Latha" w:hAnsi="Latha" w:cs="Latha"/>
+                <w:b/>
+                <w:bCs/>
+                <w:szCs w:val="24"/>
+                <w:lang w:bidi="ta-IN"/>
+                <w14:ligatures w14:val="standardContextual"/>
               </w:rPr>
               <w:t>)</w:t>
             </w:r>
             <w:r>
               <w:rPr>
-                <w:rFonts w:cs="BRH Devanagari Extra"/>
-                <w:color w:val="000000"/>
-                <w:szCs w:val="32"/>
-              </w:rPr>
-              <w:t>[P3</w:t>
-            </w:r>
-            <w:r>
-              <w:rPr>
-                <w:rFonts w:ascii="BRH Devanagari Extra" w:hAnsi="BRH Devanagari Extra" w:cs="BRH Devanagari Extra"/>
-                <w:color w:val="000000"/>
-                <w:sz w:val="32"/>
-                <w:szCs w:val="32"/>
-              </w:rPr>
-              <w:t xml:space="preserve">] </w:t>
-            </w:r>
-            <w:r>
-              <w:rPr>
-                <w:rFonts w:cs="BRH Devanagari Extra"/>
-                <w:color w:val="000000"/>
-                <w:szCs w:val="32"/>
+                <w:rFonts w:ascii="Latha" w:hAnsi="Latha" w:cs="Latha"/>
+                <w:b/>
+                <w:bCs/>
+                <w:szCs w:val="24"/>
+                <w:lang w:bidi="ta-IN"/>
+                <w14:ligatures w14:val="standardContextual"/>
+              </w:rPr>
+              <w:t>[</w:t>
+            </w:r>
+            <w:r>
+              <w:rPr>
+                <w:rFonts w:ascii="Latha" w:hAnsi="Latha" w:cs="Latha"/>
+                <w:b/>
+                <w:bCs/>
+                <w:szCs w:val="24"/>
+                <w:cs/>
+                <w:lang w:bidi="ta-IN"/>
+                <w14:ligatures w14:val="standardContextual"/>
+              </w:rPr>
+              <w:t>ப</w:t>
+            </w:r>
+            <w:r>
+              <w:rPr>
+                <w:rFonts w:ascii="Latha" w:hAnsi="Latha" w:cs="Latha"/>
+                <w:b/>
+                <w:bCs/>
+                <w:szCs w:val="24"/>
+                <w:lang w:bidi="ta-IN"/>
+                <w14:ligatures w14:val="standardContextual"/>
+              </w:rPr>
+              <w:t>3</w:t>
+            </w:r>
+            <w:r>
+              <w:rPr>
+                <w:rFonts w:ascii="Latha" w:hAnsi="Latha" w:cs="Latha"/>
+                <w:b/>
+                <w:bCs/>
+                <w:szCs w:val="24"/>
+                <w:lang w:bidi="ta-IN"/>
+                <w14:ligatures w14:val="standardContextual"/>
+              </w:rPr>
+              <w:t>]</w:t>
+            </w:r>
+            <w:r>
+              <w:rPr>
+                <w:rFonts w:ascii="Latha" w:hAnsi="Latha" w:cs="Latha"/>
+                <w:szCs w:val="24"/>
+                <w:lang w:bidi="ta-IN"/>
+                <w14:ligatures w14:val="standardContextual"/>
+              </w:rPr>
+              <w:t xml:space="preserve"> </w:t>
+            </w:r>
+            <w:r>
+              <w:rPr>
+                <w:rFonts w:ascii="Latha" w:hAnsi="Latha" w:cs="Latha"/>
+                <w:b/>
+                <w:bCs/>
+                <w:szCs w:val="24"/>
+                <w:cs/>
+                <w:lang w:bidi="ta-IN"/>
+                <w14:ligatures w14:val="standardContextual"/>
               </w:rPr>
               <w:t>7</w:t>
             </w:r>
             <w:r>
               <w:rPr>
-                <w:rFonts w:ascii="BRH Devanagari Extra" w:hAnsi="BRH Devanagari Extra" w:cs="BRH Devanagari Extra"/>
-                <w:color w:val="000000"/>
-                <w:sz w:val="32"/>
-                <w:szCs w:val="32"/>
+                <w:rFonts w:ascii="Latha" w:hAnsi="Latha" w:cs="Latha"/>
+                <w:b/>
+                <w:bCs/>
+                <w:szCs w:val="24"/>
+                <w:lang w:bidi="ta-IN"/>
+                <w14:ligatures w14:val="standardContextual"/>
+              </w:rPr>
+              <w:t>.2</w:t>
+            </w:r>
+            <w:r>
+              <w:rPr>
+                <w:rFonts w:ascii="Latha" w:hAnsi="Latha" w:cs="Latha"/>
+                <w:b/>
+                <w:bCs/>
+                <w:szCs w:val="24"/>
+                <w:lang w:bidi="ta-IN"/>
+                <w14:ligatures w14:val="standardContextual"/>
               </w:rPr>
               <w:t>.</w:t>
             </w:r>
             <w:r>
               <w:rPr>
-                <w:rFonts w:cs="BRH Devanagari Extra"/>
-                <w:color w:val="000000"/>
-                <w:szCs w:val="32"/>
-              </w:rPr>
-              <w:t>2</w:t>
-            </w:r>
-            <w:r>
-              <w:rPr>
-                <w:rFonts w:ascii="BRH Devanagari Extra" w:hAnsi="BRH Devanagari Extra" w:cs="BRH Devanagari Extra"/>
-                <w:color w:val="000000"/>
-                <w:sz w:val="32"/>
-                <w:szCs w:val="32"/>
-              </w:rPr>
-              <w:t>.</w:t>
-            </w:r>
-            <w:r>
-              <w:rPr>
-                <w:rFonts w:cs="BRH Devanagari Extra"/>
-                <w:color w:val="000000"/>
-                <w:szCs w:val="32"/>
+                <w:rFonts w:ascii="Latha" w:hAnsi="Latha" w:cs="Latha"/>
+                <w:b/>
+                <w:bCs/>
+                <w:szCs w:val="24"/>
+                <w:cs/>
+                <w:lang w:bidi="ta-IN"/>
+                <w14:ligatures w14:val="standardContextual"/>
               </w:rPr>
               <w:t>1</w:t>
             </w:r>
             <w:r>
               <w:rPr>
-                <w:rFonts w:ascii="BRH Devanagari Extra" w:hAnsi="BRH Devanagari Extra" w:cs="BRH Devanagari Extra"/>
-                <w:color w:val="000000"/>
-                <w:sz w:val="32"/>
-                <w:szCs w:val="32"/>
-              </w:rPr>
-              <w:t>.</w:t>
-            </w:r>
-            <w:r>
-              <w:rPr>
-                <w:rFonts w:cs="BRH Devanagari Extra"/>
-                <w:color w:val="000000"/>
-                <w:szCs w:val="32"/>
-              </w:rPr>
-              <w:t>3</w:t>
-            </w:r>
-            <w:r>
-              <w:rPr>
-                <w:rFonts w:ascii="BRH Devanagari Extra" w:hAnsi="BRH Devanagari Extra" w:cs="BRH Devanagari Extra"/>
-                <w:color w:val="000000"/>
-                <w:sz w:val="32"/>
-                <w:szCs w:val="32"/>
+                <w:rFonts w:ascii="Latha" w:hAnsi="Latha" w:cs="Latha"/>
+                <w:b/>
+                <w:bCs/>
+                <w:szCs w:val="24"/>
+                <w:lang w:bidi="ta-IN"/>
+                <w14:ligatures w14:val="standardContextual"/>
+              </w:rPr>
+              <w:t>.3</w:t>
+            </w:r>
+            <w:r>
+              <w:rPr>
+                <w:rFonts w:ascii="Latha" w:hAnsi="Latha" w:cs="Latha"/>
+                <w:b/>
+                <w:bCs/>
+                <w:szCs w:val="24"/>
+                <w:lang w:bidi="ta-IN"/>
+                <w14:ligatures w14:val="standardContextual"/>
+              </w:rPr>
+              <w:t>(4</w:t>
+            </w:r>
+            <w:r>
+              <w:rPr>
+                <w:rFonts w:ascii="Latha" w:hAnsi="Latha" w:cs="Latha"/>
+                <w:b/>
+                <w:bCs/>
+                <w:szCs w:val="24"/>
+                <w:cs/>
+                <w:lang w:bidi="ta-IN"/>
+                <w14:ligatures w14:val="standardContextual"/>
+              </w:rPr>
+              <w:t>7</w:t>
+            </w:r>
+            <w:r>
+              <w:rPr>
+                <w:rFonts w:ascii="Latha" w:hAnsi="Latha" w:cs="Latha"/>
+                <w:b/>
+                <w:bCs/>
+                <w:szCs w:val="24"/>
+                <w:lang w:bidi="ta-IN"/>
+                <w14:ligatures w14:val="standardContextual"/>
+              </w:rPr>
+              <w:t>)</w:t>
+            </w:r>
+            <w:r>
+              <w:rPr>
+                <w:rFonts w:ascii="Latha" w:hAnsi="Latha" w:cs="Latha"/>
+                <w:szCs w:val="24"/>
+                <w:lang w:bidi="ta-IN"/>
+                <w14:ligatures w14:val="standardContextual"/>
+              </w:rPr>
+              <w:t xml:space="preserve">-  </w:t>
+            </w:r>
+            <w:r>
+              <w:rPr>
+                <w:rFonts w:ascii="Latha" w:hAnsi="Latha" w:cs="Latha"/>
+                <w:szCs w:val="24"/>
+                <w:cs/>
+                <w:lang w:bidi="ta-IN"/>
+                <w14:ligatures w14:val="standardContextual"/>
+              </w:rPr>
+              <w:t xml:space="preserve">ப்ராங் </w:t>
+            </w:r>
+            <w:r>
+              <w:rPr>
+                <w:rFonts w:ascii="Latha" w:hAnsi="Latha" w:cs="Latha"/>
+                <w:szCs w:val="24"/>
+                <w:lang w:bidi="ta-IN"/>
+                <w14:ligatures w14:val="standardContextual"/>
+              </w:rPr>
+              <w:t xml:space="preserve">| </w:t>
+            </w:r>
+            <w:r>
+              <w:rPr>
+                <w:rFonts w:ascii="Latha" w:hAnsi="Latha" w:cs="Latha"/>
+                <w:szCs w:val="24"/>
+                <w:cs/>
+                <w:lang w:bidi="ta-IN"/>
+                <w14:ligatures w14:val="standardContextual"/>
+              </w:rPr>
+              <w:t>இ</w:t>
+            </w:r>
+            <w:r>
+              <w:rPr>
+                <w:rFonts w:ascii="BRH Tamil Tab Extra" w:hAnsi="BRH Tamil Tab Extra" w:cs="Latha"/>
+                <w:b/>
+                <w:bCs/>
+                <w:szCs w:val="28"/>
+                <w:lang w:bidi="ta-IN"/>
+                <w14:ligatures w14:val="standardContextual"/>
+              </w:rPr>
+              <w:t>…</w:t>
+            </w:r>
+            <w:r>
+              <w:rPr>
+                <w:rFonts w:ascii="Latha" w:hAnsi="Latha" w:cs="Latha"/>
+                <w:szCs w:val="24"/>
+                <w:cs/>
+                <w:lang w:bidi="ta-IN"/>
+                <w14:ligatures w14:val="standardContextual"/>
+              </w:rPr>
+              <w:t>வ</w:t>
+            </w:r>
+            <w:r>
+              <w:rPr>
+                <w:rFonts w:ascii="BRH Tamil Tab Extra" w:hAnsi="BRH Tamil Tab Extra" w:cs="Latha"/>
+                <w:b/>
+                <w:bCs/>
+                <w:szCs w:val="28"/>
+                <w:lang w:bidi="ta-IN"/>
+                <w14:ligatures w14:val="standardContextual"/>
+              </w:rPr>
+              <w:t>…</w:t>
+            </w:r>
+            <w:r>
+              <w:rPr>
+                <w:rFonts w:ascii="Latha" w:hAnsi="Latha" w:cs="Latha"/>
+                <w:szCs w:val="24"/>
+                <w:lang w:bidi="ta-IN"/>
+                <w14:ligatures w14:val="standardContextual"/>
+              </w:rPr>
+              <w:t xml:space="preserve"> | </w:t>
+            </w:r>
+            <w:r>
+              <w:rPr>
+                <w:rFonts w:ascii="Latha" w:hAnsi="Latha" w:cs="Latha"/>
+                <w:b/>
+                <w:bCs/>
+                <w:szCs w:val="24"/>
+                <w:lang w:bidi="ta-IN"/>
+                <w14:ligatures w14:val="standardContextual"/>
               </w:rPr>
               <w:t>(</w:t>
             </w:r>
             <w:r>
               <w:rPr>
-                <w:rFonts w:cs="BRH Devanagari Extra"/>
-                <w:color w:val="000000"/>
-                <w:szCs w:val="32"/>
-              </w:rPr>
-              <w:t>47</w:t>
-            </w:r>
-            <w:r>
-              <w:rPr>
-                <w:rFonts w:ascii="BRH Devanagari Extra" w:hAnsi="BRH Devanagari Extra" w:cs="BRH Devanagari Extra"/>
-                <w:color w:val="000000"/>
-                <w:sz w:val="32"/>
-                <w:szCs w:val="32"/>
-              </w:rPr>
-              <w:t>)- mÉëÉXèû | C</w:t>
-            </w:r>
-            <w:r>
-              <w:rPr>
-                <w:rFonts w:ascii="BRH Malayalam Extra" w:hAnsi="BRH Malayalam Extra" w:cs="BRH Devanagari Extra"/>
-                <w:color w:val="000000"/>
-                <w:szCs w:val="32"/>
-              </w:rPr>
-              <w:t>–</w:t>
-            </w:r>
-            <w:r>
-              <w:rPr>
-                <w:rFonts w:ascii="BRH Devanagari Extra" w:hAnsi="BRH Devanagari Extra" w:cs="BRH Devanagari Extra"/>
-                <w:color w:val="000000"/>
-                <w:sz w:val="32"/>
-                <w:szCs w:val="32"/>
-              </w:rPr>
-              <w:t>uÉ</w:t>
-            </w:r>
-            <w:r>
-              <w:rPr>
-                <w:rFonts w:ascii="BRH Malayalam Extra" w:hAnsi="BRH Malayalam Extra" w:cs="BRH Devanagari Extra"/>
-                <w:color w:val="000000"/>
-                <w:szCs w:val="32"/>
-              </w:rPr>
-              <w:t>–</w:t>
-            </w:r>
-            <w:r>
-              <w:rPr>
-                <w:rFonts w:ascii="BRH Devanagari Extra" w:hAnsi="BRH Devanagari Extra" w:cs="BRH Devanagari Extra"/>
-                <w:color w:val="000000"/>
-                <w:sz w:val="32"/>
-                <w:szCs w:val="32"/>
-              </w:rPr>
-              <w:t xml:space="preserve"> | </w:t>
+                <w:rFonts w:ascii="Latha" w:hAnsi="Latha" w:cs="Latha"/>
+                <w:b/>
+                <w:bCs/>
+                <w:szCs w:val="24"/>
+                <w:lang w:bidi="ta-IN"/>
+                <w14:ligatures w14:val="standardContextual"/>
+              </w:rPr>
+              <w:t>GS</w:t>
+            </w:r>
+            <w:r>
+              <w:rPr>
+                <w:rFonts w:ascii="Latha" w:hAnsi="Latha" w:cs="Latha"/>
+                <w:szCs w:val="24"/>
+                <w:lang w:bidi="ta-IN"/>
+                <w14:ligatures w14:val="standardContextual"/>
+              </w:rPr>
+              <w:t>-</w:t>
+            </w:r>
+            <w:r>
+              <w:rPr>
+                <w:rFonts w:ascii="Latha" w:hAnsi="Latha" w:cs="Latha"/>
+                <w:b/>
+                <w:bCs/>
+                <w:szCs w:val="24"/>
+                <w:cs/>
+                <w:lang w:bidi="ta-IN"/>
+                <w14:ligatures w14:val="standardContextual"/>
+              </w:rPr>
+              <w:t>7</w:t>
+            </w:r>
+            <w:r>
+              <w:rPr>
+                <w:rFonts w:ascii="Latha" w:hAnsi="Latha" w:cs="Latha"/>
+                <w:b/>
+                <w:bCs/>
+                <w:szCs w:val="24"/>
+                <w:lang w:bidi="ta-IN"/>
+                <w14:ligatures w14:val="standardContextual"/>
+              </w:rPr>
+              <w:t>.2</w:t>
+            </w:r>
+            <w:r>
+              <w:rPr>
+                <w:rFonts w:ascii="Latha" w:hAnsi="Latha" w:cs="Latha"/>
+                <w:szCs w:val="24"/>
+                <w:lang w:bidi="ta-IN"/>
+                <w14:ligatures w14:val="standardContextual"/>
+              </w:rPr>
+              <w:t>-</w:t>
+            </w:r>
+            <w:r>
+              <w:rPr>
+                <w:rFonts w:ascii="Latha" w:hAnsi="Latha" w:cs="Latha"/>
+                <w:b/>
+                <w:bCs/>
+                <w:szCs w:val="24"/>
+                <w:lang w:bidi="ta-IN"/>
+                <w14:ligatures w14:val="standardContextual"/>
+              </w:rPr>
+              <w:t>0</w:t>
+            </w:r>
+            <w:r>
+              <w:rPr>
+                <w:rFonts w:ascii="Latha" w:hAnsi="Latha" w:cs="Latha"/>
+                <w:b/>
+                <w:bCs/>
+                <w:szCs w:val="24"/>
+                <w:cs/>
+                <w:lang w:bidi="ta-IN"/>
+                <w14:ligatures w14:val="standardContextual"/>
+              </w:rPr>
+              <w:t>3)</w:t>
             </w:r>
           </w:p>
           <w:p>
@@ -667,58 +1076,106 @@
             </w:pPr>
             <w:r>
               <w:rPr>
-                <w:rFonts w:ascii="BRH Devanagari Extra" w:hAnsi="BRH Devanagari Extra" w:cs="BRH Devanagari Extra"/>
-                <w:color w:val="000000"/>
-                <w:sz w:val="32"/>
-                <w:szCs w:val="32"/>
+                <w:rFonts w:ascii="Latha" w:hAnsi="Latha" w:cs="Latha"/>
+                <w:szCs w:val="24"/>
                 <w:highlight w:val="green"/>
-              </w:rPr>
-              <w:t>mÉëÉÌX</w:t>
-            </w:r>
-            <w:r>
-              <w:rPr>
-                <w:rFonts w:ascii="BRH Devanagari Extra" w:hAnsi="BRH Devanagari Extra" w:cs="BRH Devanagari Extra"/>
-                <w:color w:val="000000"/>
-                <w:sz w:val="32"/>
-                <w:szCs w:val="32"/>
-              </w:rPr>
-              <w:t>ûþuÉåuÉ</w:t>
-            </w:r>
-            <w:r>
-              <w:rPr>
-                <w:rFonts w:ascii="BRH Malayalam Extra" w:hAnsi="BRH Malayalam Extra" w:cs="BRH Devanagari Extra"/>
-                <w:color w:val="000000"/>
-                <w:szCs w:val="32"/>
-              </w:rPr>
-              <w:t>–</w:t>
-            </w:r>
-            <w:r>
-              <w:rPr>
-                <w:rFonts w:ascii="BRH Devanagari Extra" w:hAnsi="BRH Devanagari Extra" w:cs="BRH Devanagari Extra"/>
-                <w:color w:val="000000"/>
-                <w:sz w:val="32"/>
-                <w:szCs w:val="32"/>
-              </w:rPr>
-              <w:t xml:space="preserve"> mÉëÉXèû </w:t>
-            </w:r>
-            <w:r>
-              <w:rPr>
-                <w:rFonts w:ascii="BRH Devanagari Extra" w:hAnsi="BRH Devanagari Extra" w:cs="BRH Devanagari Extra"/>
-                <w:color w:val="000000"/>
-                <w:sz w:val="32"/>
-                <w:szCs w:val="32"/>
+                <w:cs/>
+                <w:lang w:bidi="ta-IN"/>
+                <w14:ligatures w14:val="standardContextual"/>
+              </w:rPr>
+              <w:t>ப்ராஙி</w:t>
+            </w:r>
+            <w:r>
+              <w:rPr>
+                <w:rFonts w:ascii="BRH Tamil Tab Extra" w:hAnsi="BRH Tamil Tab Extra" w:cs="Latha"/>
+                <w:b/>
+                <w:bCs/>
+                <w:szCs w:val="28"/>
+                <w:lang w:bidi="ta-IN"/>
+                <w14:ligatures w14:val="standardContextual"/>
+              </w:rPr>
+              <w:t>†</w:t>
+            </w:r>
+            <w:r>
+              <w:rPr>
+                <w:rFonts w:ascii="Latha" w:hAnsi="Latha" w:cs="Latha"/>
+                <w:szCs w:val="24"/>
+                <w:cs/>
+                <w:lang w:bidi="ta-IN"/>
+                <w14:ligatures w14:val="standardContextual"/>
+              </w:rPr>
+              <w:t>வேவ</w:t>
+            </w:r>
+            <w:r>
+              <w:rPr>
+                <w:rFonts w:ascii="BRH Tamil Tab Extra" w:hAnsi="BRH Tamil Tab Extra" w:cs="Latha"/>
+                <w:b/>
+                <w:bCs/>
+                <w:szCs w:val="28"/>
+                <w:lang w:bidi="ta-IN"/>
+                <w14:ligatures w14:val="standardContextual"/>
+              </w:rPr>
+              <w:t>…</w:t>
+            </w:r>
+            <w:r>
+              <w:rPr>
+                <w:rFonts w:ascii="Latha" w:hAnsi="Latha" w:cs="Latha"/>
+                <w:szCs w:val="24"/>
+                <w:lang w:bidi="ta-IN"/>
+                <w14:ligatures w14:val="standardContextual"/>
+              </w:rPr>
+              <w:t xml:space="preserve"> </w:t>
+            </w:r>
+            <w:r>
+              <w:rPr>
+                <w:rFonts w:ascii="Latha" w:hAnsi="Latha" w:cs="Latha"/>
+                <w:szCs w:val="24"/>
+                <w:cs/>
+                <w:lang w:bidi="ta-IN"/>
+                <w14:ligatures w14:val="standardContextual"/>
+              </w:rPr>
+              <w:t xml:space="preserve">ப்ராங் </w:t>
+            </w:r>
+            <w:r>
+              <w:rPr>
+                <w:rFonts w:ascii="Latha" w:hAnsi="Latha" w:cs="Latha"/>
+                <w:szCs w:val="24"/>
                 <w:highlight w:val="green"/>
-              </w:rPr>
-              <w:t>mÉëÉÌX</w:t>
-            </w:r>
-            <w:r>
-              <w:rPr>
-                <w:rFonts w:ascii="BRH Devanagari Extra" w:hAnsi="BRH Devanagari Extra" w:cs="BRH Devanagari Extra"/>
-                <w:color w:val="000000"/>
-                <w:sz w:val="32"/>
-                <w:szCs w:val="32"/>
-              </w:rPr>
-              <w:t xml:space="preserve">ûþuÉ | </w:t>
+                <w:cs/>
+                <w:lang w:bidi="ta-IN"/>
+                <w14:ligatures w14:val="standardContextual"/>
+              </w:rPr>
+              <w:t>ப்ராஙி</w:t>
+            </w:r>
+            <w:r>
+              <w:rPr>
+                <w:rFonts w:ascii="BRH Tamil Tab Extra" w:hAnsi="BRH Tamil Tab Extra" w:cs="Latha"/>
+                <w:b/>
+                <w:bCs/>
+                <w:szCs w:val="28"/>
+                <w:lang w:bidi="ta-IN"/>
+                <w14:ligatures w14:val="standardContextual"/>
+              </w:rPr>
+              <w:t>†</w:t>
+            </w:r>
+            <w:r>
+              <w:rPr>
+                <w:rFonts w:ascii="Latha" w:hAnsi="Latha" w:cs="Latha"/>
+                <w:szCs w:val="24"/>
+                <w:cs/>
+                <w:lang w:bidi="ta-IN"/>
+                <w14:ligatures w14:val="standardContextual"/>
+              </w:rPr>
+              <w:t xml:space="preserve">வ </w:t>
+            </w:r>
+            <w:r>
+              <w:rPr>
+                <w:rFonts w:ascii="Latha" w:hAnsi="Latha" w:cs="Latha"/>
+                <w:szCs w:val="24"/>
+                <w:lang w:bidi="ta-IN"/>
+                <w14:ligatures w14:val="standardContextual"/>
+              </w:rPr>
+              <w:t>|</w:t>
             </w:r>
           </w:p>
         </w:tc>
@@ -733,145 +1190,306 @@
           </w:tcPr>
           <w:p>
             <w:pPr>
-              <w:widowControl w:val="0"/>
               <w:autoSpaceDE w:val="0"/>
               <w:autoSpaceDN w:val="0"/>
               <w:adjustRightInd w:val="0"/>
-              <w:spacing w:line="240" w:lineRule="auto"/>
-              <w:rPr>
-                <w:rFonts w:ascii="BRH Devanagari Extra" w:hAnsi="BRH Devanagari Extra" w:cs="BRH Devanagari Extra"/>
-                <w:color w:val="000000"/>
-                <w:sz w:val="32"/>
-                <w:szCs w:val="32"/>
+              <w:rPr>
+                <w:rFonts w:ascii="Latha" w:hAnsi="Latha" w:cs="Latha"/>
+                <w:szCs w:val="24"/>
+                <w:lang w:bidi="ta-IN"/>
+                <w14:ligatures w14:val="standardContextual"/>
               </w:rPr>
             </w:pPr>
             <w:r>
               <w:rPr>
-                <w:rFonts w:ascii="BRH Devanagari Extra" w:hAnsi="BRH Devanagari Extra" w:cs="BRH Devanagari Extra"/>
-                <w:color w:val="000000"/>
-                <w:sz w:val="32"/>
-                <w:szCs w:val="32"/>
+                <w:rFonts w:ascii="Latha" w:hAnsi="Latha" w:cs="Latha"/>
+                <w:b/>
+                <w:bCs/>
+                <w:szCs w:val="24"/>
+                <w:lang w:bidi="ta-IN"/>
+                <w14:ligatures w14:val="standardContextual"/>
               </w:rPr>
               <w:t>(</w:t>
             </w:r>
             <w:r>
               <w:rPr>
-                <w:rFonts w:cs="BRH Devanagari Extra"/>
-                <w:color w:val="000000"/>
-                <w:szCs w:val="32"/>
+                <w:rFonts w:ascii="Latha" w:hAnsi="Latha" w:cs="Latha"/>
+                <w:b/>
+                <w:bCs/>
+                <w:szCs w:val="24"/>
+                <w:cs/>
+                <w:lang w:bidi="ta-IN"/>
+                <w14:ligatures w14:val="standardContextual"/>
               </w:rPr>
               <w:t>58</w:t>
             </w:r>
             <w:r>
               <w:rPr>
-                <w:rFonts w:ascii="BRH Devanagari Extra" w:hAnsi="BRH Devanagari Extra" w:cs="BRH Devanagari Extra"/>
-                <w:color w:val="000000"/>
-                <w:sz w:val="32"/>
-                <w:szCs w:val="32"/>
+                <w:rFonts w:ascii="Latha" w:hAnsi="Latha" w:cs="Latha"/>
+                <w:b/>
+                <w:bCs/>
+                <w:szCs w:val="24"/>
+                <w:lang w:bidi="ta-IN"/>
+                <w14:ligatures w14:val="standardContextual"/>
               </w:rPr>
               <w:t>)</w:t>
             </w:r>
             <w:r>
               <w:rPr>
-                <w:rFonts w:cs="BRH Devanagari Extra"/>
-                <w:color w:val="000000"/>
-                <w:szCs w:val="32"/>
-              </w:rPr>
-              <w:t>[P26</w:t>
-            </w:r>
-            <w:r>
-              <w:rPr>
-                <w:rFonts w:ascii="BRH Devanagari Extra" w:hAnsi="BRH Devanagari Extra" w:cs="BRH Devanagari Extra"/>
-                <w:color w:val="000000"/>
-                <w:sz w:val="32"/>
-                <w:szCs w:val="32"/>
-              </w:rPr>
-              <w:t xml:space="preserve">] </w:t>
-            </w:r>
-            <w:r>
-              <w:rPr>
-                <w:rFonts w:cs="BRH Devanagari Extra"/>
-                <w:color w:val="000000"/>
-                <w:szCs w:val="32"/>
+                <w:rFonts w:ascii="Latha" w:hAnsi="Latha" w:cs="Latha"/>
+                <w:b/>
+                <w:bCs/>
+                <w:szCs w:val="24"/>
+                <w:lang w:bidi="ta-IN"/>
+                <w14:ligatures w14:val="standardContextual"/>
+              </w:rPr>
+              <w:t>[</w:t>
+            </w:r>
+            <w:r>
+              <w:rPr>
+                <w:rFonts w:ascii="Latha" w:hAnsi="Latha" w:cs="Latha"/>
+                <w:b/>
+                <w:bCs/>
+                <w:szCs w:val="24"/>
+                <w:cs/>
+                <w:lang w:bidi="ta-IN"/>
+                <w14:ligatures w14:val="standardContextual"/>
+              </w:rPr>
+              <w:t>ப</w:t>
+            </w:r>
+            <w:r>
+              <w:rPr>
+                <w:rFonts w:ascii="Latha" w:hAnsi="Latha" w:cs="Latha"/>
+                <w:b/>
+                <w:bCs/>
+                <w:szCs w:val="24"/>
+                <w:lang w:bidi="ta-IN"/>
+                <w14:ligatures w14:val="standardContextual"/>
+              </w:rPr>
+              <w:t>2</w:t>
+            </w:r>
+            <w:r>
+              <w:rPr>
+                <w:rFonts w:ascii="Latha" w:hAnsi="Latha" w:cs="Latha"/>
+                <w:b/>
+                <w:bCs/>
+                <w:szCs w:val="24"/>
+                <w:cs/>
+                <w:lang w:bidi="ta-IN"/>
+                <w14:ligatures w14:val="standardContextual"/>
+              </w:rPr>
+              <w:t>6</w:t>
+            </w:r>
+            <w:r>
+              <w:rPr>
+                <w:rFonts w:ascii="Latha" w:hAnsi="Latha" w:cs="Latha"/>
+                <w:b/>
+                <w:bCs/>
+                <w:szCs w:val="24"/>
+                <w:lang w:bidi="ta-IN"/>
+                <w14:ligatures w14:val="standardContextual"/>
+              </w:rPr>
+              <w:t>]</w:t>
+            </w:r>
+            <w:r>
+              <w:rPr>
+                <w:rFonts w:ascii="Latha" w:hAnsi="Latha" w:cs="Latha"/>
+                <w:szCs w:val="24"/>
+                <w:lang w:bidi="ta-IN"/>
+                <w14:ligatures w14:val="standardContextual"/>
+              </w:rPr>
+              <w:t xml:space="preserve"> </w:t>
+            </w:r>
+            <w:r>
+              <w:rPr>
+                <w:rFonts w:ascii="Latha" w:hAnsi="Latha" w:cs="Latha"/>
+                <w:b/>
+                <w:bCs/>
+                <w:szCs w:val="24"/>
+                <w:cs/>
+                <w:lang w:bidi="ta-IN"/>
+                <w14:ligatures w14:val="standardContextual"/>
               </w:rPr>
               <w:t>7</w:t>
             </w:r>
             <w:r>
               <w:rPr>
-                <w:rFonts w:ascii="BRH Devanagari Extra" w:hAnsi="BRH Devanagari Extra" w:cs="BRH Devanagari Extra"/>
-                <w:color w:val="000000"/>
-                <w:sz w:val="32"/>
-                <w:szCs w:val="32"/>
+                <w:rFonts w:ascii="Latha" w:hAnsi="Latha" w:cs="Latha"/>
+                <w:b/>
+                <w:bCs/>
+                <w:szCs w:val="24"/>
+                <w:lang w:bidi="ta-IN"/>
+                <w14:ligatures w14:val="standardContextual"/>
+              </w:rPr>
+              <w:t>.2</w:t>
+            </w:r>
+            <w:r>
+              <w:rPr>
+                <w:rFonts w:ascii="Latha" w:hAnsi="Latha" w:cs="Latha"/>
+                <w:b/>
+                <w:bCs/>
+                <w:szCs w:val="24"/>
+                <w:lang w:bidi="ta-IN"/>
+                <w14:ligatures w14:val="standardContextual"/>
               </w:rPr>
               <w:t>.</w:t>
             </w:r>
             <w:r>
               <w:rPr>
-                <w:rFonts w:cs="BRH Devanagari Extra"/>
-                <w:color w:val="000000"/>
-                <w:szCs w:val="32"/>
-              </w:rPr>
-              <w:t>2</w:t>
-            </w:r>
-            <w:r>
-              <w:rPr>
-                <w:rFonts w:ascii="BRH Devanagari Extra" w:hAnsi="BRH Devanagari Extra" w:cs="BRH Devanagari Extra"/>
-                <w:color w:val="000000"/>
-                <w:sz w:val="32"/>
-                <w:szCs w:val="32"/>
+                <w:rFonts w:ascii="Latha" w:hAnsi="Latha" w:cs="Latha"/>
+                <w:b/>
+                <w:bCs/>
+                <w:szCs w:val="24"/>
+                <w:cs/>
+                <w:lang w:bidi="ta-IN"/>
+                <w14:ligatures w14:val="standardContextual"/>
+              </w:rPr>
+              <w:t>7</w:t>
+            </w:r>
+            <w:r>
+              <w:rPr>
+                <w:rFonts w:ascii="Latha" w:hAnsi="Latha" w:cs="Latha"/>
+                <w:b/>
+                <w:bCs/>
+                <w:szCs w:val="24"/>
+                <w:lang w:bidi="ta-IN"/>
+                <w14:ligatures w14:val="standardContextual"/>
               </w:rPr>
               <w:t>.</w:t>
             </w:r>
             <w:r>
               <w:rPr>
-                <w:rFonts w:cs="BRH Devanagari Extra"/>
-                <w:color w:val="000000"/>
-                <w:szCs w:val="32"/>
-              </w:rPr>
-              <w:t>7</w:t>
-            </w:r>
-            <w:r>
-              <w:rPr>
-                <w:rFonts w:ascii="BRH Devanagari Extra" w:hAnsi="BRH Devanagari Extra" w:cs="BRH Devanagari Extra"/>
-                <w:color w:val="000000"/>
-                <w:sz w:val="32"/>
-                <w:szCs w:val="32"/>
+                <w:rFonts w:ascii="Latha" w:hAnsi="Latha" w:cs="Latha"/>
+                <w:b/>
+                <w:bCs/>
+                <w:szCs w:val="24"/>
+                <w:cs/>
+                <w:lang w:bidi="ta-IN"/>
+                <w14:ligatures w14:val="standardContextual"/>
+              </w:rPr>
+              <w:t>5</w:t>
+            </w:r>
+            <w:r>
+              <w:rPr>
+                <w:rFonts w:ascii="Latha" w:hAnsi="Latha" w:cs="Latha"/>
+                <w:b/>
+                <w:bCs/>
+                <w:szCs w:val="24"/>
+                <w:lang w:bidi="ta-IN"/>
+                <w14:ligatures w14:val="standardContextual"/>
+              </w:rPr>
+              <w:t>(</w:t>
+            </w:r>
+            <w:r>
+              <w:rPr>
+                <w:rFonts w:ascii="Latha" w:hAnsi="Latha" w:cs="Latha"/>
+                <w:b/>
+                <w:bCs/>
+                <w:szCs w:val="24"/>
+                <w:cs/>
+                <w:lang w:bidi="ta-IN"/>
+                <w14:ligatures w14:val="standardContextual"/>
+              </w:rPr>
+              <w:t>5</w:t>
+            </w:r>
+            <w:r>
+              <w:rPr>
+                <w:rFonts w:ascii="Latha" w:hAnsi="Latha" w:cs="Latha"/>
+                <w:b/>
+                <w:bCs/>
+                <w:szCs w:val="24"/>
+                <w:cs/>
+                <w:lang w:bidi="ta-IN"/>
+                <w14:ligatures w14:val="standardContextual"/>
+              </w:rPr>
+              <w:t>4)</w:t>
+            </w:r>
+            <w:r>
+              <w:rPr>
+                <w:rFonts w:ascii="Latha" w:hAnsi="Latha" w:cs="Latha"/>
+                <w:szCs w:val="24"/>
+                <w:lang w:bidi="ta-IN"/>
+                <w14:ligatures w14:val="standardContextual"/>
+              </w:rPr>
+              <w:t xml:space="preserve">-  </w:t>
+            </w:r>
+            <w:r>
+              <w:rPr>
+                <w:rFonts w:ascii="Latha" w:hAnsi="Latha" w:cs="Latha"/>
+                <w:szCs w:val="24"/>
+                <w:cs/>
+                <w:lang w:bidi="ta-IN"/>
+                <w14:ligatures w14:val="standardContextual"/>
+              </w:rPr>
+              <w:t xml:space="preserve">ந </w:t>
+            </w:r>
+            <w:r>
+              <w:rPr>
+                <w:rFonts w:ascii="Latha" w:hAnsi="Latha" w:cs="Latha"/>
+                <w:szCs w:val="24"/>
+                <w:lang w:bidi="ta-IN"/>
+                <w14:ligatures w14:val="standardContextual"/>
+              </w:rPr>
+              <w:t xml:space="preserve">| </w:t>
+            </w:r>
+            <w:r>
+              <w:rPr>
+                <w:rFonts w:ascii="Latha" w:hAnsi="Latha" w:cs="Latha"/>
+                <w:szCs w:val="24"/>
+                <w:cs/>
+                <w:lang w:bidi="ta-IN"/>
+                <w14:ligatures w14:val="standardContextual"/>
+              </w:rPr>
+              <w:t>வர்</w:t>
+            </w:r>
+            <w:r>
+              <w:rPr>
+                <w:rFonts w:ascii="Latha" w:hAnsi="Latha" w:cs="Latha"/>
+                <w:b/>
+                <w:bCs/>
+                <w:szCs w:val="24"/>
+                <w:lang w:bidi="ta-IN"/>
+                <w14:ligatures w14:val="standardContextual"/>
               </w:rPr>
               <w:t>.</w:t>
             </w:r>
             <w:r>
               <w:rPr>
-                <w:rFonts w:cs="BRH Devanagari Extra"/>
-                <w:color w:val="000000"/>
-                <w:szCs w:val="32"/>
-              </w:rPr>
-              <w:t>5</w:t>
-            </w:r>
-            <w:r>
-              <w:rPr>
-                <w:rFonts w:ascii="BRH Devanagari Extra" w:hAnsi="BRH Devanagari Extra" w:cs="BRH Devanagari Extra"/>
-                <w:color w:val="000000"/>
-                <w:sz w:val="32"/>
-                <w:szCs w:val="32"/>
-              </w:rPr>
-              <w:t>(</w:t>
-            </w:r>
-            <w:r>
-              <w:rPr>
-                <w:rFonts w:cs="BRH Devanagari Extra"/>
-                <w:color w:val="000000"/>
-                <w:szCs w:val="32"/>
-              </w:rPr>
-              <w:t>54</w:t>
-            </w:r>
-            <w:r>
-              <w:rPr>
-                <w:rFonts w:ascii="BRH Devanagari Extra" w:hAnsi="BRH Devanagari Extra" w:cs="BRH Devanagari Extra"/>
-                <w:color w:val="000000"/>
-                <w:sz w:val="32"/>
-                <w:szCs w:val="32"/>
-              </w:rPr>
-              <w:t>)- lÉ | uÉUç.wÉåÿiÉç |</w:t>
+                <w:rFonts w:ascii="Latha" w:hAnsi="Latha" w:cs="Latha"/>
+                <w:szCs w:val="24"/>
+                <w:cs/>
+                <w:lang w:bidi="ta-IN"/>
+                <w14:ligatures w14:val="standardContextual"/>
+              </w:rPr>
+              <w:t>ஷே</w:t>
+            </w:r>
+            <w:r>
+              <w:rPr>
+                <w:rFonts w:ascii="BRH Tamil Tab Extra" w:hAnsi="BRH Tamil Tab Extra" w:cs="Latha"/>
+                <w:szCs w:val="28"/>
+                <w:lang w:bidi="ta-IN"/>
+                <w14:ligatures w14:val="standardContextual"/>
+              </w:rPr>
+              <w:t>‡</w:t>
+            </w:r>
+            <w:r>
+              <w:rPr>
+                <w:rFonts w:ascii="Latha" w:hAnsi="Latha" w:cs="Latha"/>
+                <w:szCs w:val="24"/>
+                <w:cs/>
+                <w:lang w:bidi="ta-IN"/>
+                <w14:ligatures w14:val="standardContextual"/>
+              </w:rPr>
+              <w:t xml:space="preserve">த் </w:t>
+            </w:r>
+            <w:r>
+              <w:rPr>
+                <w:rFonts w:ascii="Latha" w:hAnsi="Latha" w:cs="Latha"/>
+                <w:szCs w:val="24"/>
+                <w:lang w:bidi="ta-IN"/>
+                <w14:ligatures w14:val="standardContextual"/>
+              </w:rPr>
+              <w:t>|</w:t>
             </w:r>
           </w:p>
           <w:p>
@@ -882,79 +1500,165 @@
               <w:adjustRightInd w:val="0"/>
               <w:spacing w:line="240" w:lineRule="auto"/>
               <w:rPr>
-                <w:rFonts w:ascii="BRH Devanagari Extra" w:hAnsi="BRH Devanagari Extra" w:cs="BRH Devanagari Extra"/>
-                <w:color w:val="000000"/>
-                <w:sz w:val="32"/>
-                <w:szCs w:val="32"/>
-              </w:rPr>
-            </w:pPr>
-            <w:r>
-              <w:rPr>
-                <w:rFonts w:ascii="BRH Devanagari Extra" w:hAnsi="BRH Devanagari Extra" w:cs="BRH Devanagari Extra"/>
-                <w:color w:val="000000"/>
-                <w:sz w:val="32"/>
-                <w:szCs w:val="32"/>
-              </w:rPr>
-              <w:t>lÉ uÉUç.wÉå</w:t>
-            </w:r>
-            <w:r>
-              <w:rPr>
-                <w:rFonts w:ascii="BRH Malayalam Extra" w:hAnsi="BRH Malayalam Extra" w:cs="BRH Devanagari Extra"/>
-                <w:color w:val="000000"/>
-                <w:szCs w:val="32"/>
-              </w:rPr>
-              <w:t>–</w:t>
-            </w:r>
-            <w:r>
-              <w:rPr>
-                <w:rFonts w:ascii="BRH Devanagari Extra" w:hAnsi="BRH Devanagari Extra" w:cs="BRH Devanagari Extra"/>
-                <w:color w:val="000000"/>
-                <w:sz w:val="32"/>
-                <w:szCs w:val="32"/>
-              </w:rPr>
-              <w:t>iÉç uÉUç.wÉå</w:t>
-            </w:r>
-            <w:r>
-              <w:rPr>
-                <w:rFonts w:ascii="BRH Malayalam Extra" w:hAnsi="BRH Malayalam Extra" w:cs="BRH Devanagari Extra"/>
-                <w:color w:val="000000"/>
-                <w:szCs w:val="32"/>
-                <w:highlight w:val="yellow"/>
-              </w:rPr>
-              <w:t>–</w:t>
-            </w:r>
-            <w:r>
-              <w:rPr>
-                <w:rFonts w:ascii="BRH Devanagari Extra" w:hAnsi="BRH Devanagari Extra" w:cs="BRH Devanagari Extra"/>
-                <w:color w:val="000000"/>
-                <w:sz w:val="32"/>
-                <w:szCs w:val="32"/>
-                <w:highlight w:val="yellow"/>
-              </w:rPr>
-              <w:t>iÉ</w:t>
-            </w:r>
-            <w:r>
-              <w:rPr>
-                <w:rFonts w:ascii="BRH Devanagari Extra" w:hAnsi="BRH Devanagari Extra" w:cs="BRH Devanagari Extra"/>
-                <w:color w:val="000000"/>
-                <w:sz w:val="32"/>
-                <w:szCs w:val="32"/>
-              </w:rPr>
-              <w:t xml:space="preserve">ç lÉ lÉ uÉUç.wÉåÿiÉç | </w:t>
-            </w:r>
-          </w:p>
-          <w:p>
-            <w:pPr>
-              <w:widowControl w:val="0"/>
-              <w:autoSpaceDE w:val="0"/>
-              <w:autoSpaceDN w:val="0"/>
-              <w:adjustRightInd w:val="0"/>
-              <w:spacing w:before="0" w:line="240" w:lineRule="auto"/>
-              <w:rPr>
                 <w:rFonts w:cs="BRH Malayalam Extra"/>
                 <w:szCs w:val="40"/>
               </w:rPr>
             </w:pPr>
+            <w:r>
+              <w:rPr>
+                <w:rFonts w:ascii="Latha" w:hAnsi="Latha" w:cs="Latha"/>
+                <w:szCs w:val="24"/>
+                <w:cs/>
+                <w:lang w:bidi="ta-IN"/>
+                <w14:ligatures w14:val="standardContextual"/>
+              </w:rPr>
+              <w:t>ந வர்</w:t>
+            </w:r>
+            <w:r>
+              <w:rPr>
+                <w:rFonts w:ascii="Latha" w:hAnsi="Latha" w:cs="Latha"/>
+                <w:b/>
+                <w:bCs/>
+                <w:szCs w:val="24"/>
+                <w:lang w:bidi="ta-IN"/>
+                <w14:ligatures w14:val="standardContextual"/>
+              </w:rPr>
+              <w:t>.</w:t>
+            </w:r>
+            <w:r>
+              <w:rPr>
+                <w:rFonts w:ascii="Latha" w:hAnsi="Latha" w:cs="Latha"/>
+                <w:szCs w:val="24"/>
+                <w:cs/>
+                <w:lang w:bidi="ta-IN"/>
+                <w14:ligatures w14:val="standardContextual"/>
+              </w:rPr>
+              <w:t>ஷே</w:t>
+            </w:r>
+            <w:r>
+              <w:rPr>
+                <w:rFonts w:ascii="BRH Tamil Tab Extra" w:hAnsi="BRH Tamil Tab Extra" w:cs="Latha"/>
+                <w:b/>
+                <w:bCs/>
+                <w:szCs w:val="28"/>
+                <w:lang w:bidi="ta-IN"/>
+                <w14:ligatures w14:val="standardContextual"/>
+              </w:rPr>
+              <w:t>…</w:t>
+            </w:r>
+            <w:r>
+              <w:rPr>
+                <w:rFonts w:ascii="Latha" w:hAnsi="Latha" w:cs="Latha"/>
+                <w:szCs w:val="24"/>
+                <w:cs/>
+                <w:lang w:bidi="ta-IN"/>
+                <w14:ligatures w14:val="standardContextual"/>
+              </w:rPr>
+              <w:t>த் வர்</w:t>
+            </w:r>
+            <w:r>
+              <w:rPr>
+                <w:rFonts w:ascii="Latha" w:hAnsi="Latha" w:cs="Latha"/>
+                <w:b/>
+                <w:bCs/>
+                <w:szCs w:val="24"/>
+                <w:lang w:bidi="ta-IN"/>
+                <w14:ligatures w14:val="standardContextual"/>
+              </w:rPr>
+              <w:t>.</w:t>
+            </w:r>
+            <w:r>
+              <w:rPr>
+                <w:rFonts w:ascii="Latha" w:hAnsi="Latha" w:cs="Latha"/>
+                <w:szCs w:val="24"/>
+                <w:cs/>
+                <w:lang w:bidi="ta-IN"/>
+                <w14:ligatures w14:val="standardContextual"/>
+              </w:rPr>
+              <w:t>ஷே</w:t>
+            </w:r>
+            <w:r>
+              <w:rPr>
+                <w:rFonts w:ascii="BRH Tamil Tab Extra" w:hAnsi="BRH Tamil Tab Extra" w:cs="Latha"/>
+                <w:b/>
+                <w:bCs/>
+                <w:szCs w:val="28"/>
+                <w:highlight w:val="yellow"/>
+                <w:lang w:bidi="ta-IN"/>
+                <w14:ligatures w14:val="standardContextual"/>
+              </w:rPr>
+              <w:t>…</w:t>
+            </w:r>
+            <w:r>
+              <w:rPr>
+                <w:rFonts w:ascii="Latha" w:hAnsi="Latha" w:cs="Latha"/>
+                <w:szCs w:val="24"/>
+                <w:highlight w:val="yellow"/>
+                <w:cs/>
+                <w:lang w:bidi="ta-IN"/>
+                <w14:ligatures w14:val="standardContextual"/>
+              </w:rPr>
+              <w:t>த் ந</w:t>
+            </w:r>
+            <w:r>
+              <w:rPr>
+                <w:rFonts w:ascii="Latha" w:hAnsi="Latha" w:cs="Latha"/>
+                <w:szCs w:val="24"/>
+                <w:cs/>
+                <w:lang w:bidi="ta-IN"/>
+                <w14:ligatures w14:val="standardContextual"/>
+              </w:rPr>
+              <w:t xml:space="preserve"> ந வர்</w:t>
+            </w:r>
+            <w:r>
+              <w:rPr>
+                <w:rFonts w:ascii="Latha" w:hAnsi="Latha" w:cs="Latha"/>
+                <w:b/>
+                <w:bCs/>
+                <w:szCs w:val="24"/>
+                <w:lang w:bidi="ta-IN"/>
+                <w14:ligatures w14:val="standardContextual"/>
+              </w:rPr>
+              <w:t>.</w:t>
+            </w:r>
+            <w:r>
+              <w:rPr>
+                <w:rFonts w:ascii="Latha" w:hAnsi="Latha" w:cs="Latha"/>
+                <w:szCs w:val="24"/>
+                <w:cs/>
+                <w:lang w:bidi="ta-IN"/>
+                <w14:ligatures w14:val="standardContextual"/>
+              </w:rPr>
+              <w:t>ஷே</w:t>
+            </w:r>
+            <w:r>
+              <w:rPr>
+                <w:rFonts w:ascii="BRH Tamil Tab Extra" w:hAnsi="BRH Tamil Tab Extra" w:cs="Latha"/>
+                <w:szCs w:val="28"/>
+                <w:lang w:bidi="ta-IN"/>
+                <w14:ligatures w14:val="standardContextual"/>
+              </w:rPr>
+              <w:t>‡</w:t>
+            </w:r>
+            <w:r>
+              <w:rPr>
+                <w:rFonts w:ascii="Latha" w:hAnsi="Latha" w:cs="Latha"/>
+                <w:szCs w:val="24"/>
+                <w:cs/>
+                <w:lang w:bidi="ta-IN"/>
+                <w14:ligatures w14:val="standardContextual"/>
+              </w:rPr>
+              <w:t xml:space="preserve">த் </w:t>
+            </w:r>
+            <w:r>
+              <w:rPr>
+                <w:rFonts w:ascii="Latha" w:hAnsi="Latha" w:cs="Latha"/>
+                <w:szCs w:val="24"/>
+                <w:lang w:bidi="ta-IN"/>
+                <w14:ligatures w14:val="standardContextual"/>
+              </w:rPr>
+              <w:t>|</w:t>
+            </w:r>
           </w:p>
         </w:tc>
         <w:tc>
@@ -963,145 +1667,306 @@
           </w:tcPr>
           <w:p>
             <w:pPr>
-              <w:widowControl w:val="0"/>
               <w:autoSpaceDE w:val="0"/>
               <w:autoSpaceDN w:val="0"/>
               <w:adjustRightInd w:val="0"/>
-              <w:spacing w:line="240" w:lineRule="auto"/>
-              <w:rPr>
-                <w:rFonts w:ascii="BRH Devanagari Extra" w:hAnsi="BRH Devanagari Extra" w:cs="BRH Devanagari Extra"/>
-                <w:color w:val="000000"/>
-                <w:sz w:val="32"/>
-                <w:szCs w:val="32"/>
+              <w:rPr>
+                <w:rFonts w:ascii="Latha" w:hAnsi="Latha" w:cs="Latha"/>
+                <w:szCs w:val="24"/>
+                <w:lang w:bidi="ta-IN"/>
+                <w14:ligatures w14:val="standardContextual"/>
               </w:rPr>
             </w:pPr>
             <w:r>
               <w:rPr>
-                <w:rFonts w:ascii="BRH Devanagari Extra" w:hAnsi="BRH Devanagari Extra" w:cs="BRH Devanagari Extra"/>
-                <w:color w:val="000000"/>
-                <w:sz w:val="32"/>
-                <w:szCs w:val="32"/>
+                <w:rFonts w:ascii="Latha" w:hAnsi="Latha" w:cs="Latha"/>
+                <w:b/>
+                <w:bCs/>
+                <w:szCs w:val="24"/>
+                <w:lang w:bidi="ta-IN"/>
+                <w14:ligatures w14:val="standardContextual"/>
               </w:rPr>
               <w:t>(</w:t>
             </w:r>
             <w:r>
               <w:rPr>
-                <w:rFonts w:cs="BRH Devanagari Extra"/>
-                <w:color w:val="000000"/>
-                <w:szCs w:val="32"/>
+                <w:rFonts w:ascii="Latha" w:hAnsi="Latha" w:cs="Latha"/>
+                <w:b/>
+                <w:bCs/>
+                <w:szCs w:val="24"/>
+                <w:cs/>
+                <w:lang w:bidi="ta-IN"/>
+                <w14:ligatures w14:val="standardContextual"/>
               </w:rPr>
               <w:t>58</w:t>
             </w:r>
             <w:r>
               <w:rPr>
-                <w:rFonts w:ascii="BRH Devanagari Extra" w:hAnsi="BRH Devanagari Extra" w:cs="BRH Devanagari Extra"/>
-                <w:color w:val="000000"/>
-                <w:sz w:val="32"/>
-                <w:szCs w:val="32"/>
+                <w:rFonts w:ascii="Latha" w:hAnsi="Latha" w:cs="Latha"/>
+                <w:b/>
+                <w:bCs/>
+                <w:szCs w:val="24"/>
+                <w:lang w:bidi="ta-IN"/>
+                <w14:ligatures w14:val="standardContextual"/>
               </w:rPr>
               <w:t>)</w:t>
             </w:r>
             <w:r>
               <w:rPr>
-                <w:rFonts w:cs="BRH Devanagari Extra"/>
-                <w:color w:val="000000"/>
-                <w:szCs w:val="32"/>
-              </w:rPr>
-              <w:t>[P26</w:t>
-            </w:r>
-            <w:r>
-              <w:rPr>
-                <w:rFonts w:ascii="BRH Devanagari Extra" w:hAnsi="BRH Devanagari Extra" w:cs="BRH Devanagari Extra"/>
-                <w:color w:val="000000"/>
-                <w:sz w:val="32"/>
-                <w:szCs w:val="32"/>
-              </w:rPr>
-              <w:t xml:space="preserve">] </w:t>
-            </w:r>
-            <w:r>
-              <w:rPr>
-                <w:rFonts w:cs="BRH Devanagari Extra"/>
-                <w:color w:val="000000"/>
-                <w:szCs w:val="32"/>
+                <w:rFonts w:ascii="Latha" w:hAnsi="Latha" w:cs="Latha"/>
+                <w:b/>
+                <w:bCs/>
+                <w:szCs w:val="24"/>
+                <w:lang w:bidi="ta-IN"/>
+                <w14:ligatures w14:val="standardContextual"/>
+              </w:rPr>
+              <w:t>[</w:t>
+            </w:r>
+            <w:r>
+              <w:rPr>
+                <w:rFonts w:ascii="Latha" w:hAnsi="Latha" w:cs="Latha"/>
+                <w:b/>
+                <w:bCs/>
+                <w:szCs w:val="24"/>
+                <w:cs/>
+                <w:lang w:bidi="ta-IN"/>
+                <w14:ligatures w14:val="standardContextual"/>
+              </w:rPr>
+              <w:t>ப</w:t>
+            </w:r>
+            <w:r>
+              <w:rPr>
+                <w:rFonts w:ascii="Latha" w:hAnsi="Latha" w:cs="Latha"/>
+                <w:b/>
+                <w:bCs/>
+                <w:szCs w:val="24"/>
+                <w:lang w:bidi="ta-IN"/>
+                <w14:ligatures w14:val="standardContextual"/>
+              </w:rPr>
+              <w:t>2</w:t>
+            </w:r>
+            <w:r>
+              <w:rPr>
+                <w:rFonts w:ascii="Latha" w:hAnsi="Latha" w:cs="Latha"/>
+                <w:b/>
+                <w:bCs/>
+                <w:szCs w:val="24"/>
+                <w:cs/>
+                <w:lang w:bidi="ta-IN"/>
+                <w14:ligatures w14:val="standardContextual"/>
+              </w:rPr>
+              <w:t>6</w:t>
+            </w:r>
+            <w:r>
+              <w:rPr>
+                <w:rFonts w:ascii="Latha" w:hAnsi="Latha" w:cs="Latha"/>
+                <w:b/>
+                <w:bCs/>
+                <w:szCs w:val="24"/>
+                <w:lang w:bidi="ta-IN"/>
+                <w14:ligatures w14:val="standardContextual"/>
+              </w:rPr>
+              <w:t>]</w:t>
+            </w:r>
+            <w:r>
+              <w:rPr>
+                <w:rFonts w:ascii="Latha" w:hAnsi="Latha" w:cs="Latha"/>
+                <w:szCs w:val="24"/>
+                <w:lang w:bidi="ta-IN"/>
+                <w14:ligatures w14:val="standardContextual"/>
+              </w:rPr>
+              <w:t xml:space="preserve"> </w:t>
+            </w:r>
+            <w:r>
+              <w:rPr>
+                <w:rFonts w:ascii="Latha" w:hAnsi="Latha" w:cs="Latha"/>
+                <w:b/>
+                <w:bCs/>
+                <w:szCs w:val="24"/>
+                <w:cs/>
+                <w:lang w:bidi="ta-IN"/>
+                <w14:ligatures w14:val="standardContextual"/>
               </w:rPr>
               <w:t>7</w:t>
             </w:r>
             <w:r>
               <w:rPr>
-                <w:rFonts w:ascii="BRH Devanagari Extra" w:hAnsi="BRH Devanagari Extra" w:cs="BRH Devanagari Extra"/>
-                <w:color w:val="000000"/>
-                <w:sz w:val="32"/>
-                <w:szCs w:val="32"/>
+                <w:rFonts w:ascii="Latha" w:hAnsi="Latha" w:cs="Latha"/>
+                <w:b/>
+                <w:bCs/>
+                <w:szCs w:val="24"/>
+                <w:lang w:bidi="ta-IN"/>
+                <w14:ligatures w14:val="standardContextual"/>
+              </w:rPr>
+              <w:t>.2</w:t>
+            </w:r>
+            <w:r>
+              <w:rPr>
+                <w:rFonts w:ascii="Latha" w:hAnsi="Latha" w:cs="Latha"/>
+                <w:b/>
+                <w:bCs/>
+                <w:szCs w:val="24"/>
+                <w:lang w:bidi="ta-IN"/>
+                <w14:ligatures w14:val="standardContextual"/>
               </w:rPr>
               <w:t>.</w:t>
             </w:r>
             <w:r>
               <w:rPr>
-                <w:rFonts w:cs="BRH Devanagari Extra"/>
-                <w:color w:val="000000"/>
-                <w:szCs w:val="32"/>
-              </w:rPr>
-              <w:t>2</w:t>
-            </w:r>
-            <w:r>
-              <w:rPr>
-                <w:rFonts w:ascii="BRH Devanagari Extra" w:hAnsi="BRH Devanagari Extra" w:cs="BRH Devanagari Extra"/>
-                <w:color w:val="000000"/>
-                <w:sz w:val="32"/>
-                <w:szCs w:val="32"/>
+                <w:rFonts w:ascii="Latha" w:hAnsi="Latha" w:cs="Latha"/>
+                <w:b/>
+                <w:bCs/>
+                <w:szCs w:val="24"/>
+                <w:cs/>
+                <w:lang w:bidi="ta-IN"/>
+                <w14:ligatures w14:val="standardContextual"/>
+              </w:rPr>
+              <w:t>7</w:t>
+            </w:r>
+            <w:r>
+              <w:rPr>
+                <w:rFonts w:ascii="Latha" w:hAnsi="Latha" w:cs="Latha"/>
+                <w:b/>
+                <w:bCs/>
+                <w:szCs w:val="24"/>
+                <w:lang w:bidi="ta-IN"/>
+                <w14:ligatures w14:val="standardContextual"/>
               </w:rPr>
               <w:t>.</w:t>
             </w:r>
             <w:r>
               <w:rPr>
-                <w:rFonts w:cs="BRH Devanagari Extra"/>
-                <w:color w:val="000000"/>
-                <w:szCs w:val="32"/>
-              </w:rPr>
-              <w:t>7</w:t>
-            </w:r>
-            <w:r>
-              <w:rPr>
-                <w:rFonts w:ascii="BRH Devanagari Extra" w:hAnsi="BRH Devanagari Extra" w:cs="BRH Devanagari Extra"/>
-                <w:color w:val="000000"/>
-                <w:sz w:val="32"/>
-                <w:szCs w:val="32"/>
+                <w:rFonts w:ascii="Latha" w:hAnsi="Latha" w:cs="Latha"/>
+                <w:b/>
+                <w:bCs/>
+                <w:szCs w:val="24"/>
+                <w:cs/>
+                <w:lang w:bidi="ta-IN"/>
+                <w14:ligatures w14:val="standardContextual"/>
+              </w:rPr>
+              <w:t>5</w:t>
+            </w:r>
+            <w:r>
+              <w:rPr>
+                <w:rFonts w:ascii="Latha" w:hAnsi="Latha" w:cs="Latha"/>
+                <w:b/>
+                <w:bCs/>
+                <w:szCs w:val="24"/>
+                <w:lang w:bidi="ta-IN"/>
+                <w14:ligatures w14:val="standardContextual"/>
+              </w:rPr>
+              <w:t>(</w:t>
+            </w:r>
+            <w:r>
+              <w:rPr>
+                <w:rFonts w:ascii="Latha" w:hAnsi="Latha" w:cs="Latha"/>
+                <w:b/>
+                <w:bCs/>
+                <w:szCs w:val="24"/>
+                <w:cs/>
+                <w:lang w:bidi="ta-IN"/>
+                <w14:ligatures w14:val="standardContextual"/>
+              </w:rPr>
+              <w:t>5</w:t>
+            </w:r>
+            <w:r>
+              <w:rPr>
+                <w:rFonts w:ascii="Latha" w:hAnsi="Latha" w:cs="Latha"/>
+                <w:b/>
+                <w:bCs/>
+                <w:szCs w:val="24"/>
+                <w:cs/>
+                <w:lang w:bidi="ta-IN"/>
+                <w14:ligatures w14:val="standardContextual"/>
+              </w:rPr>
+              <w:t>4)</w:t>
+            </w:r>
+            <w:r>
+              <w:rPr>
+                <w:rFonts w:ascii="Latha" w:hAnsi="Latha" w:cs="Latha"/>
+                <w:szCs w:val="24"/>
+                <w:lang w:bidi="ta-IN"/>
+                <w14:ligatures w14:val="standardContextual"/>
+              </w:rPr>
+              <w:t xml:space="preserve">-  </w:t>
+            </w:r>
+            <w:r>
+              <w:rPr>
+                <w:rFonts w:ascii="Latha" w:hAnsi="Latha" w:cs="Latha"/>
+                <w:szCs w:val="24"/>
+                <w:cs/>
+                <w:lang w:bidi="ta-IN"/>
+                <w14:ligatures w14:val="standardContextual"/>
+              </w:rPr>
+              <w:t xml:space="preserve">ந </w:t>
+            </w:r>
+            <w:r>
+              <w:rPr>
+                <w:rFonts w:ascii="Latha" w:hAnsi="Latha" w:cs="Latha"/>
+                <w:szCs w:val="24"/>
+                <w:lang w:bidi="ta-IN"/>
+                <w14:ligatures w14:val="standardContextual"/>
+              </w:rPr>
+              <w:t xml:space="preserve">| </w:t>
+            </w:r>
+            <w:r>
+              <w:rPr>
+                <w:rFonts w:ascii="Latha" w:hAnsi="Latha" w:cs="Latha"/>
+                <w:szCs w:val="24"/>
+                <w:cs/>
+                <w:lang w:bidi="ta-IN"/>
+                <w14:ligatures w14:val="standardContextual"/>
+              </w:rPr>
+              <w:t>வர்</w:t>
+            </w:r>
+            <w:r>
+              <w:rPr>
+                <w:rFonts w:ascii="Latha" w:hAnsi="Latha" w:cs="Latha"/>
+                <w:b/>
+                <w:bCs/>
+                <w:szCs w:val="24"/>
+                <w:lang w:bidi="ta-IN"/>
+                <w14:ligatures w14:val="standardContextual"/>
               </w:rPr>
               <w:t>.</w:t>
             </w:r>
             <w:r>
               <w:rPr>
-                <w:rFonts w:cs="BRH Devanagari Extra"/>
-                <w:color w:val="000000"/>
-                <w:szCs w:val="32"/>
-              </w:rPr>
-              <w:t>5</w:t>
-            </w:r>
-            <w:r>
-              <w:rPr>
-                <w:rFonts w:ascii="BRH Devanagari Extra" w:hAnsi="BRH Devanagari Extra" w:cs="BRH Devanagari Extra"/>
-                <w:color w:val="000000"/>
-                <w:sz w:val="32"/>
-                <w:szCs w:val="32"/>
-              </w:rPr>
-              <w:t>(</w:t>
-            </w:r>
-            <w:r>
-              <w:rPr>
-                <w:rFonts w:cs="BRH Devanagari Extra"/>
-                <w:color w:val="000000"/>
-                <w:szCs w:val="32"/>
-              </w:rPr>
-              <w:t>54</w:t>
-            </w:r>
-            <w:r>
-              <w:rPr>
-                <w:rFonts w:ascii="BRH Devanagari Extra" w:hAnsi="BRH Devanagari Extra" w:cs="BRH Devanagari Extra"/>
-                <w:color w:val="000000"/>
-                <w:sz w:val="32"/>
-                <w:szCs w:val="32"/>
-              </w:rPr>
-              <w:t>)- lÉ | uÉUç.wÉåÿiÉç |</w:t>
+                <w:rFonts w:ascii="Latha" w:hAnsi="Latha" w:cs="Latha"/>
+                <w:szCs w:val="24"/>
+                <w:cs/>
+                <w:lang w:bidi="ta-IN"/>
+                <w14:ligatures w14:val="standardContextual"/>
+              </w:rPr>
+              <w:t>ஷே</w:t>
+            </w:r>
+            <w:r>
+              <w:rPr>
+                <w:rFonts w:ascii="BRH Tamil Tab Extra" w:hAnsi="BRH Tamil Tab Extra" w:cs="Latha"/>
+                <w:szCs w:val="28"/>
+                <w:lang w:bidi="ta-IN"/>
+                <w14:ligatures w14:val="standardContextual"/>
+              </w:rPr>
+              <w:t>‡</w:t>
+            </w:r>
+            <w:r>
+              <w:rPr>
+                <w:rFonts w:ascii="Latha" w:hAnsi="Latha" w:cs="Latha"/>
+                <w:szCs w:val="24"/>
+                <w:cs/>
+                <w:lang w:bidi="ta-IN"/>
+                <w14:ligatures w14:val="standardContextual"/>
+              </w:rPr>
+              <w:t xml:space="preserve">த் </w:t>
+            </w:r>
+            <w:r>
+              <w:rPr>
+                <w:rFonts w:ascii="Latha" w:hAnsi="Latha" w:cs="Latha"/>
+                <w:szCs w:val="24"/>
+                <w:lang w:bidi="ta-IN"/>
+                <w14:ligatures w14:val="standardContextual"/>
+              </w:rPr>
+              <w:t>|</w:t>
             </w:r>
           </w:p>
           <w:p>
@@ -1120,67 +1985,169 @@
             </w:pPr>
             <w:r>
               <w:rPr>
-                <w:rFonts w:ascii="BRH Devanagari Extra" w:hAnsi="BRH Devanagari Extra" w:cs="BRH Devanagari Extra"/>
-                <w:color w:val="000000"/>
-                <w:sz w:val="32"/>
-                <w:szCs w:val="32"/>
-              </w:rPr>
-              <w:t>lÉ uÉUç.wÉå</w:t>
-            </w:r>
-            <w:r>
-              <w:rPr>
-                <w:rFonts w:ascii="BRH Malayalam Extra" w:hAnsi="BRH Malayalam Extra" w:cs="BRH Devanagari Extra"/>
-                <w:color w:val="000000"/>
-                <w:szCs w:val="32"/>
-              </w:rPr>
-              <w:t>–</w:t>
-            </w:r>
-            <w:r>
-              <w:rPr>
-                <w:rFonts w:ascii="BRH Devanagari Extra" w:hAnsi="BRH Devanagari Extra" w:cs="BRH Devanagari Extra"/>
-                <w:color w:val="000000"/>
-                <w:sz w:val="32"/>
-                <w:szCs w:val="32"/>
-              </w:rPr>
-              <w:t>iÉç uÉUç.</w:t>
-            </w:r>
-            <w:r>
-              <w:rPr>
-                <w:rFonts w:ascii="BRH Devanagari Extra" w:hAnsi="BRH Devanagari Extra" w:cs="BRH Devanagari Extra"/>
-                <w:color w:val="000000"/>
-                <w:sz w:val="32"/>
-                <w:szCs w:val="32"/>
+                <w:rFonts w:ascii="Latha" w:hAnsi="Latha" w:cs="Latha"/>
+                <w:szCs w:val="24"/>
+                <w:cs/>
+                <w:lang w:bidi="ta-IN"/>
+                <w14:ligatures w14:val="standardContextual"/>
+              </w:rPr>
+              <w:t>ந வர்</w:t>
+            </w:r>
+            <w:r>
+              <w:rPr>
+                <w:rFonts w:ascii="Latha" w:hAnsi="Latha" w:cs="Latha"/>
+                <w:b/>
+                <w:bCs/>
+                <w:szCs w:val="24"/>
+                <w:lang w:bidi="ta-IN"/>
+                <w14:ligatures w14:val="standardContextual"/>
+              </w:rPr>
+              <w:t>.</w:t>
+            </w:r>
+            <w:r>
+              <w:rPr>
+                <w:rFonts w:ascii="Latha" w:hAnsi="Latha" w:cs="Latha"/>
+                <w:szCs w:val="24"/>
+                <w:cs/>
+                <w:lang w:bidi="ta-IN"/>
+                <w14:ligatures w14:val="standardContextual"/>
+              </w:rPr>
+              <w:t>ஷே</w:t>
+            </w:r>
+            <w:r>
+              <w:rPr>
+                <w:rFonts w:ascii="BRH Tamil Tab Extra" w:hAnsi="BRH Tamil Tab Extra" w:cs="Latha"/>
+                <w:b/>
+                <w:bCs/>
+                <w:szCs w:val="28"/>
+                <w:lang w:bidi="ta-IN"/>
+                <w14:ligatures w14:val="standardContextual"/>
+              </w:rPr>
+              <w:t>…</w:t>
+            </w:r>
+            <w:r>
+              <w:rPr>
+                <w:rFonts w:ascii="Latha" w:hAnsi="Latha" w:cs="Latha"/>
+                <w:szCs w:val="24"/>
+                <w:cs/>
+                <w:lang w:bidi="ta-IN"/>
+                <w14:ligatures w14:val="standardContextual"/>
+              </w:rPr>
+              <w:t>த் வர்</w:t>
+            </w:r>
+            <w:r>
+              <w:rPr>
+                <w:rFonts w:ascii="Latha" w:hAnsi="Latha" w:cs="Latha"/>
+                <w:b/>
+                <w:bCs/>
+                <w:szCs w:val="24"/>
+                <w:lang w:bidi="ta-IN"/>
+                <w14:ligatures w14:val="standardContextual"/>
+              </w:rPr>
+              <w:t>.</w:t>
+            </w:r>
+            <w:r>
+              <w:rPr>
+                <w:rFonts w:ascii="Latha" w:hAnsi="Latha" w:cs="Latha"/>
+                <w:szCs w:val="24"/>
+                <w:cs/>
+                <w:lang w:bidi="ta-IN"/>
+                <w14:ligatures w14:val="standardContextual"/>
+              </w:rPr>
+              <w:t>ஷே</w:t>
+            </w:r>
+            <w:r>
+              <w:rPr>
+                <w:rFonts w:ascii="BRH Tamil Tab Extra" w:hAnsi="BRH Tamil Tab Extra" w:cs="Latha"/>
+                <w:b/>
+                <w:bCs/>
+                <w:szCs w:val="28"/>
                 <w:highlight w:val="green"/>
-              </w:rPr>
-              <w:t>wÉå</w:t>
-            </w:r>
-            <w:r>
-              <w:rPr>
-                <w:rFonts w:ascii="BRH Malayalam Extra" w:hAnsi="BRH Malayalam Extra" w:cs="BRH Devanagari Extra"/>
-                <w:color w:val="000000"/>
-                <w:szCs w:val="32"/>
+                <w:lang w:bidi="ta-IN"/>
+                <w14:ligatures w14:val="standardContextual"/>
+              </w:rPr>
+              <w:t>…</w:t>
+            </w:r>
+            <w:r>
+              <w:rPr>
+                <w:rFonts w:ascii="BRH Tamil Tab Extra" w:hAnsi="BRH Tamil Tab Extra" w:cs="Latha" w:hint="cs"/>
+                <w:szCs w:val="24"/>
                 <w:highlight w:val="green"/>
-              </w:rPr>
-              <w:t>–</w:t>
-            </w:r>
-            <w:r>
-              <w:rPr>
-                <w:rFonts w:ascii="BRH Devanagari Extra" w:hAnsi="BRH Devanagari Extra" w:cs="BRH Devanagari Extra"/>
-                <w:color w:val="000000"/>
-                <w:sz w:val="32"/>
-                <w:szCs w:val="32"/>
+                <w:cs/>
+                <w:lang w:bidi="ta-IN"/>
+                <w14:ligatures w14:val="standardContextual"/>
+              </w:rPr>
+              <w:t>ந்</w:t>
+            </w:r>
+            <w:r>
+              <w:rPr>
+                <w:rFonts w:ascii="Latha" w:hAnsi="Latha" w:cs="Latha"/>
+                <w:szCs w:val="24"/>
                 <w:highlight w:val="green"/>
-              </w:rPr>
-              <w:t>lÉç</w:t>
-            </w:r>
-            <w:r>
-              <w:rPr>
-                <w:rFonts w:ascii="BRH Devanagari Extra" w:hAnsi="BRH Devanagari Extra" w:cs="BRH Devanagari Extra"/>
-                <w:color w:val="000000"/>
-                <w:sz w:val="32"/>
-                <w:szCs w:val="32"/>
-              </w:rPr>
-              <w:t xml:space="preserve"> lÉ lÉ uÉUç.wÉåÿiÉç | </w:t>
+                <w:cs/>
+                <w:lang w:bidi="ta-IN"/>
+                <w14:ligatures w14:val="standardContextual"/>
+              </w:rPr>
+              <w:t xml:space="preserve"> ந</w:t>
+            </w:r>
+            <w:r>
+              <w:rPr>
+                <w:rFonts w:ascii="Latha" w:hAnsi="Latha" w:cs="Latha"/>
+                <w:szCs w:val="24"/>
+                <w:cs/>
+                <w:lang w:bidi="ta-IN"/>
+                <w14:ligatures w14:val="standardContextual"/>
+              </w:rPr>
+              <w:t xml:space="preserve"> ந வர்</w:t>
+            </w:r>
+            <w:r>
+              <w:rPr>
+                <w:rFonts w:ascii="Latha" w:hAnsi="Latha" w:cs="Latha"/>
+                <w:b/>
+                <w:bCs/>
+                <w:szCs w:val="24"/>
+                <w:lang w:bidi="ta-IN"/>
+                <w14:ligatures w14:val="standardContextual"/>
+              </w:rPr>
+              <w:t>.</w:t>
+            </w:r>
+            <w:r>
+              <w:rPr>
+                <w:rFonts w:ascii="Latha" w:hAnsi="Latha" w:cs="Latha"/>
+                <w:szCs w:val="24"/>
+                <w:cs/>
+                <w:lang w:bidi="ta-IN"/>
+                <w14:ligatures w14:val="standardContextual"/>
+              </w:rPr>
+              <w:t>ஷே</w:t>
+            </w:r>
+            <w:r>
+              <w:rPr>
+                <w:rFonts w:ascii="BRH Tamil Tab Extra" w:hAnsi="BRH Tamil Tab Extra" w:cs="Latha"/>
+                <w:szCs w:val="28"/>
+                <w:lang w:bidi="ta-IN"/>
+                <w14:ligatures w14:val="standardContextual"/>
+              </w:rPr>
+              <w:t>‡</w:t>
+            </w:r>
+            <w:r>
+              <w:rPr>
+                <w:rFonts w:ascii="Latha" w:hAnsi="Latha" w:cs="Latha"/>
+                <w:szCs w:val="24"/>
+                <w:cs/>
+                <w:lang w:bidi="ta-IN"/>
+                <w14:ligatures w14:val="standardContextual"/>
+              </w:rPr>
+              <w:t xml:space="preserve">த் </w:t>
+            </w:r>
+            <w:r>
+              <w:rPr>
+                <w:rFonts w:ascii="Latha" w:hAnsi="Latha" w:cs="Latha"/>
+                <w:szCs w:val="24"/>
+                <w:lang w:bidi="ta-IN"/>
+                <w14:ligatures w14:val="standardContextual"/>
+              </w:rPr>
+              <w:t>|</w:t>
             </w:r>
           </w:p>
           <w:p>
@@ -2602,7 +3569,7 @@
   <w:style w:type="paragraph" w:default="1" w:styleId="Normal">
     <w:name w:val="Normal"/>
     <w:qFormat/>
-    <w:rsid w:val="00076C05"/>
+    <w:rsid w:val="00D71822"/>
     <w:pPr>
       <w:spacing w:before="120" w:line="276" w:lineRule="auto"/>
     </w:pPr>

</xml_diff>